<commit_message>
video y ultima actualizacion
</commit_message>
<xml_diff>
--- a/Lectarium_Memoria.docx
+++ b/Lectarium_Memoria.docx
@@ -59,7 +59,7 @@
                     <pic:cNvPicPr preferRelativeResize="0"/>
                   </pic:nvPicPr>
                   <pic:blipFill>
-                    <a:blip r:embed="rId7"/>
+                    <a:blip r:embed="rId8"/>
                     <a:srcRect/>
                     <a:stretch>
                       <a:fillRect/>
@@ -867,7 +867,7 @@
           <w:lang w:val="es-ES"/>
         </w:rPr>
         <w:lastRenderedPageBreak/>
-        <w:t>Conociendo las plataformas que existen actualmente en cuanto a libros digitales, hemos pensado en Lect</w:t>
+        <w:t xml:space="preserve">Conociendo las plataformas que existen actualmente en cuanto a libros digitales, hemos pensado en </w:t>
       </w:r>
       <w:proofErr w:type="spellStart"/>
       <w:r>
@@ -878,7 +878,7 @@
           <w:szCs w:val="24"/>
           <w:lang w:val="es-ES"/>
         </w:rPr>
-        <w:t>arium</w:t>
+        <w:t>Lectarium</w:t>
       </w:r>
       <w:proofErr w:type="spellEnd"/>
       <w:r>
@@ -1188,23 +1188,7 @@
           <w:rFonts w:ascii="Times New Roman" w:eastAsia="Arial" w:hAnsi="Times New Roman" w:cs="Times New Roman"/>
           <w:color w:val="000000"/>
         </w:rPr>
-        <w:t xml:space="preserve">Panel de usuario donde consultar la información del perfil de usuario, los favoritos, los préstamos activos </w:t>
-      </w:r>
-      <w:proofErr w:type="spellStart"/>
-      <w:r>
-        <w:rPr>
-          <w:rFonts w:ascii="Times New Roman" w:eastAsia="Arial" w:hAnsi="Times New Roman" w:cs="Times New Roman"/>
-          <w:color w:val="000000"/>
-        </w:rPr>
-        <w:t>e</w:t>
-      </w:r>
-      <w:proofErr w:type="spellEnd"/>
-      <w:r>
-        <w:rPr>
-          <w:rFonts w:ascii="Times New Roman" w:eastAsia="Arial" w:hAnsi="Times New Roman" w:cs="Times New Roman"/>
-          <w:color w:val="000000"/>
-        </w:rPr>
-        <w:t xml:space="preserve"> incluso el historial de préstamos</w:t>
+        <w:t>Panel de usuario donde consultar la información del perfil de usuario, los favoritos, los préstamos activos e incluso el historial de préstamos</w:t>
       </w:r>
     </w:p>
     <w:p>
@@ -1835,7 +1819,7 @@
                     <pic:cNvPicPr/>
                   </pic:nvPicPr>
                   <pic:blipFill>
-                    <a:blip r:embed="rId8">
+                    <a:blip r:embed="rId9">
                       <a:extLst>
                         <a:ext uri="{28A0092B-C50C-407E-A947-70E740481C1C}">
                           <a14:useLocalDpi xmlns:a14="http://schemas.microsoft.com/office/drawing/2010/main" val="0"/>
@@ -1920,7 +1904,7 @@
                     <pic:cNvPicPr/>
                   </pic:nvPicPr>
                   <pic:blipFill>
-                    <a:blip r:embed="rId9">
+                    <a:blip r:embed="rId10">
                       <a:extLst>
                         <a:ext uri="{28A0092B-C50C-407E-A947-70E740481C1C}">
                           <a14:useLocalDpi xmlns:a14="http://schemas.microsoft.com/office/drawing/2010/main" val="0"/>
@@ -2096,7 +2080,7 @@
                     <pic:cNvPicPr/>
                   </pic:nvPicPr>
                   <pic:blipFill>
-                    <a:blip r:embed="rId10" cstate="print">
+                    <a:blip r:embed="rId11" cstate="print">
                       <a:extLst>
                         <a:ext uri="{28A0092B-C50C-407E-A947-70E740481C1C}">
                           <a14:useLocalDpi xmlns:a14="http://schemas.microsoft.com/office/drawing/2010/main" val="0"/>
@@ -3419,7 +3403,7 @@
         <w:spacing w:line="360" w:lineRule="auto"/>
         <w:jc w:val="both"/>
         <w:rPr>
-          <w:rFonts w:ascii="Arial" w:eastAsia="Arial" w:hAnsi="Arial" w:cs="Arial"/>
+          <w:rFonts w:ascii="Times New Roman" w:eastAsia="Arial" w:hAnsi="Times New Roman" w:cs="Times New Roman"/>
           <w:color w:val="000000"/>
           <w:sz w:val="32"/>
           <w:szCs w:val="32"/>
@@ -3427,7 +3411,7 @@
       </w:pPr>
       <w:r>
         <w:rPr>
-          <w:rFonts w:ascii="Arial" w:eastAsia="Arial" w:hAnsi="Arial" w:cs="Arial"/>
+          <w:rFonts w:ascii="Times New Roman" w:eastAsia="Arial" w:hAnsi="Times New Roman" w:cs="Times New Roman"/>
           <w:color w:val="000000"/>
           <w:sz w:val="32"/>
           <w:szCs w:val="32"/>
@@ -3435,6 +3419,1524 @@
         <w:lastRenderedPageBreak/>
         <w:t>DESCRIPCIÓN</w:t>
       </w:r>
+    </w:p>
+    <w:p>
+      <w:pPr>
+        <w:spacing w:line="360" w:lineRule="auto"/>
+        <w:jc w:val="both"/>
+        <w:rPr>
+          <w:rFonts w:ascii="Arial" w:eastAsia="Arial" w:hAnsi="Arial" w:cs="Arial"/>
+          <w:color w:val="000000"/>
+        </w:rPr>
+      </w:pPr>
+      <w:r>
+        <w:rPr>
+          <w:rFonts w:ascii="Arial" w:eastAsia="Arial" w:hAnsi="Arial" w:cs="Arial"/>
+          <w:color w:val="000000"/>
+        </w:rPr>
+        <w:t xml:space="preserve">Nuestro proyecto </w:t>
+      </w:r>
+      <w:proofErr w:type="spellStart"/>
+      <w:r>
+        <w:rPr>
+          <w:rFonts w:ascii="Arial" w:eastAsia="Arial" w:hAnsi="Arial" w:cs="Arial"/>
+          <w:color w:val="000000"/>
+        </w:rPr>
+        <w:t>Lectarium</w:t>
+      </w:r>
+      <w:proofErr w:type="spellEnd"/>
+      <w:r>
+        <w:rPr>
+          <w:rFonts w:ascii="Arial" w:eastAsia="Arial" w:hAnsi="Arial" w:cs="Arial"/>
+          <w:color w:val="000000"/>
+        </w:rPr>
+        <w:t xml:space="preserve"> sigue una arquitectura cliente-servidor de tres capas:</w:t>
+      </w:r>
+    </w:p>
+    <w:p>
+      <w:pPr>
+        <w:pStyle w:val="Prrafodelista"/>
+        <w:numPr>
+          <w:ilvl w:val="0"/>
+          <w:numId w:val="2"/>
+        </w:numPr>
+        <w:spacing w:line="360" w:lineRule="auto"/>
+        <w:jc w:val="both"/>
+        <w:rPr>
+          <w:rFonts w:ascii="Arial" w:eastAsia="Arial" w:hAnsi="Arial" w:cs="Arial"/>
+          <w:color w:val="000000"/>
+        </w:rPr>
+      </w:pPr>
+      <w:proofErr w:type="spellStart"/>
+      <w:r>
+        <w:rPr>
+          <w:rFonts w:ascii="Arial" w:eastAsia="Arial" w:hAnsi="Arial" w:cs="Arial"/>
+          <w:color w:val="000000"/>
+        </w:rPr>
+        <w:t>Frontend</w:t>
+      </w:r>
+      <w:proofErr w:type="spellEnd"/>
+      <w:r>
+        <w:rPr>
+          <w:rFonts w:ascii="Arial" w:eastAsia="Arial" w:hAnsi="Arial" w:cs="Arial"/>
+          <w:color w:val="000000"/>
+        </w:rPr>
+        <w:t xml:space="preserve">: Que constituye la interfaz web desarrollada con HTML5, CSS3 y JavaScript, y que se comunica con el </w:t>
+      </w:r>
+      <w:proofErr w:type="spellStart"/>
+      <w:r>
+        <w:rPr>
+          <w:rFonts w:ascii="Arial" w:eastAsia="Arial" w:hAnsi="Arial" w:cs="Arial"/>
+          <w:color w:val="000000"/>
+        </w:rPr>
+        <w:t>backend</w:t>
+      </w:r>
+      <w:proofErr w:type="spellEnd"/>
+      <w:r>
+        <w:rPr>
+          <w:rFonts w:ascii="Arial" w:eastAsia="Arial" w:hAnsi="Arial" w:cs="Arial"/>
+          <w:color w:val="000000"/>
+        </w:rPr>
+        <w:t xml:space="preserve"> mediante peticiones HTTP </w:t>
+      </w:r>
+      <w:proofErr w:type="spellStart"/>
+      <w:r>
+        <w:rPr>
+          <w:rFonts w:ascii="Arial" w:eastAsia="Arial" w:hAnsi="Arial" w:cs="Arial"/>
+          <w:color w:val="000000"/>
+        </w:rPr>
+        <w:t>fetch</w:t>
+      </w:r>
+      <w:proofErr w:type="spellEnd"/>
+      <w:r>
+        <w:rPr>
+          <w:rFonts w:ascii="Arial" w:eastAsia="Arial" w:hAnsi="Arial" w:cs="Arial"/>
+          <w:color w:val="000000"/>
+        </w:rPr>
+        <w:t>() a la API REST.</w:t>
+      </w:r>
+    </w:p>
+    <w:p>
+      <w:pPr>
+        <w:pStyle w:val="Prrafodelista"/>
+        <w:numPr>
+          <w:ilvl w:val="0"/>
+          <w:numId w:val="2"/>
+        </w:numPr>
+        <w:spacing w:line="360" w:lineRule="auto"/>
+        <w:jc w:val="both"/>
+        <w:rPr>
+          <w:rFonts w:ascii="Arial" w:eastAsia="Arial" w:hAnsi="Arial" w:cs="Arial"/>
+          <w:color w:val="000000"/>
+        </w:rPr>
+      </w:pPr>
+      <w:proofErr w:type="spellStart"/>
+      <w:r>
+        <w:rPr>
+          <w:rFonts w:ascii="Arial" w:eastAsia="Arial" w:hAnsi="Arial" w:cs="Arial"/>
+          <w:color w:val="000000"/>
+        </w:rPr>
+        <w:t>Backend</w:t>
+      </w:r>
+      <w:proofErr w:type="spellEnd"/>
+      <w:r>
+        <w:rPr>
+          <w:rFonts w:ascii="Arial" w:eastAsia="Arial" w:hAnsi="Arial" w:cs="Arial"/>
+          <w:color w:val="000000"/>
+        </w:rPr>
+        <w:t>: Se trata del servidor desarrollado con Node.js y Express.js que gestiona la lógica del proyecto, procesa las peticiones y devuelve respuestas en formato JSON.</w:t>
+      </w:r>
+    </w:p>
+    <w:p>
+      <w:pPr>
+        <w:pStyle w:val="Prrafodelista"/>
+        <w:numPr>
+          <w:ilvl w:val="0"/>
+          <w:numId w:val="2"/>
+        </w:numPr>
+        <w:spacing w:line="360" w:lineRule="auto"/>
+        <w:jc w:val="both"/>
+        <w:rPr>
+          <w:rFonts w:ascii="Arial" w:eastAsia="Arial" w:hAnsi="Arial" w:cs="Arial"/>
+          <w:color w:val="000000"/>
+        </w:rPr>
+      </w:pPr>
+      <w:r>
+        <w:rPr>
+          <w:rFonts w:ascii="Arial" w:eastAsia="Arial" w:hAnsi="Arial" w:cs="Arial"/>
+          <w:color w:val="000000"/>
+        </w:rPr>
+        <w:t>Base de datos: Un servidor SQL que almacena toda la información de usuarios, libros, préstamos y favoritos.</w:t>
+      </w:r>
+    </w:p>
+    <w:p>
+      <w:pPr>
+        <w:spacing w:line="360" w:lineRule="auto"/>
+        <w:jc w:val="both"/>
+        <w:rPr>
+          <w:rFonts w:ascii="Arial" w:eastAsia="Arial" w:hAnsi="Arial" w:cs="Arial"/>
+          <w:color w:val="000000"/>
+        </w:rPr>
+      </w:pPr>
+      <w:r>
+        <w:rPr>
+          <w:rFonts w:ascii="Arial" w:eastAsia="Arial" w:hAnsi="Arial" w:cs="Arial"/>
+          <w:color w:val="000000"/>
+        </w:rPr>
+        <w:t>El flujo de una petición sería el siguiente:</w:t>
+      </w:r>
+    </w:p>
+    <w:p>
+      <w:pPr>
+        <w:spacing w:after="0" w:line="240" w:lineRule="auto"/>
+        <w:rPr>
+          <w:rFonts w:ascii="Times New Roman" w:eastAsia="Times New Roman" w:hAnsi="Times New Roman" w:cs="Times New Roman"/>
+          <w:sz w:val="24"/>
+          <w:szCs w:val="24"/>
+          <w:lang w:val="es-ES"/>
+        </w:rPr>
+      </w:pPr>
+      <w:r>
+        <w:rPr>
+          <w:rFonts w:ascii="Times New Roman" w:eastAsia="Times New Roman" w:hAnsi="Times New Roman" w:cs="Times New Roman"/>
+          <w:noProof/>
+          <w:sz w:val="24"/>
+          <w:szCs w:val="24"/>
+          <w:lang w:val="es-ES"/>
+        </w:rPr>
+        <w:drawing>
+          <wp:inline distT="0" distB="0" distL="0" distR="0" wp14:anchorId="7A327CD8" wp14:editId="4352CC30">
+            <wp:extent cx="6109947" cy="448888"/>
+            <wp:effectExtent l="0" t="0" r="0" b="8890"/>
+            <wp:docPr id="2" name="Imagen 1"/>
+            <wp:cNvGraphicFramePr>
+              <a:graphicFrameLocks xmlns:a="http://schemas.openxmlformats.org/drawingml/2006/main" noChangeAspect="1"/>
+            </wp:cNvGraphicFramePr>
+            <a:graphic xmlns:a="http://schemas.openxmlformats.org/drawingml/2006/main">
+              <a:graphicData uri="http://schemas.openxmlformats.org/drawingml/2006/picture">
+                <pic:pic xmlns:pic="http://schemas.openxmlformats.org/drawingml/2006/picture">
+                  <pic:nvPicPr>
+                    <pic:cNvPr id="0" name="Picture 2"/>
+                    <pic:cNvPicPr>
+                      <a:picLocks noChangeAspect="1" noChangeArrowheads="1"/>
+                    </pic:cNvPicPr>
+                  </pic:nvPicPr>
+                  <pic:blipFill>
+                    <a:blip r:embed="rId12" cstate="print">
+                      <a:extLst>
+                        <a:ext uri="{28A0092B-C50C-407E-A947-70E740481C1C}">
+                          <a14:useLocalDpi xmlns:a14="http://schemas.microsoft.com/office/drawing/2010/main" val="0"/>
+                        </a:ext>
+                      </a:extLst>
+                    </a:blip>
+                    <a:srcRect/>
+                    <a:stretch>
+                      <a:fillRect/>
+                    </a:stretch>
+                  </pic:blipFill>
+                  <pic:spPr bwMode="auto">
+                    <a:xfrm>
+                      <a:off x="0" y="0"/>
+                      <a:ext cx="6478989" cy="476001"/>
+                    </a:xfrm>
+                    <a:prstGeom prst="rect">
+                      <a:avLst/>
+                    </a:prstGeom>
+                    <a:noFill/>
+                    <a:ln>
+                      <a:noFill/>
+                    </a:ln>
+                  </pic:spPr>
+                </pic:pic>
+              </a:graphicData>
+            </a:graphic>
+          </wp:inline>
+        </w:drawing>
+      </w:r>
+    </w:p>
+    <w:p>
+      <w:pPr>
+        <w:spacing w:line="360" w:lineRule="auto"/>
+        <w:jc w:val="both"/>
+        <w:rPr>
+          <w:rFonts w:ascii="Arial" w:eastAsia="Arial" w:hAnsi="Arial" w:cs="Arial"/>
+          <w:color w:val="000000"/>
+        </w:rPr>
+      </w:pPr>
+    </w:p>
+    <w:p>
+      <w:pPr>
+        <w:spacing w:line="360" w:lineRule="auto"/>
+        <w:jc w:val="both"/>
+        <w:rPr>
+          <w:rFonts w:ascii="Times New Roman" w:eastAsia="Arial" w:hAnsi="Times New Roman" w:cs="Times New Roman"/>
+          <w:b/>
+          <w:bCs/>
+          <w:color w:val="000000"/>
+          <w:sz w:val="28"/>
+          <w:szCs w:val="28"/>
+          <w:u w:val="single"/>
+        </w:rPr>
+      </w:pPr>
+      <w:r>
+        <w:rPr>
+          <w:rFonts w:ascii="Times New Roman" w:eastAsia="Arial" w:hAnsi="Times New Roman" w:cs="Times New Roman"/>
+          <w:b/>
+          <w:bCs/>
+          <w:color w:val="000000"/>
+          <w:sz w:val="28"/>
+          <w:szCs w:val="28"/>
+          <w:u w:val="single"/>
+        </w:rPr>
+        <w:t>PRINCIPALES CASOS DE USO</w:t>
+      </w:r>
+    </w:p>
+    <w:p>
+      <w:pPr>
+        <w:pStyle w:val="Prrafodelista"/>
+        <w:numPr>
+          <w:ilvl w:val="0"/>
+          <w:numId w:val="6"/>
+        </w:numPr>
+        <w:spacing w:line="360" w:lineRule="auto"/>
+        <w:jc w:val="both"/>
+        <w:rPr>
+          <w:rFonts w:ascii="Times New Roman" w:eastAsia="Arial" w:hAnsi="Times New Roman" w:cs="Times New Roman"/>
+          <w:color w:val="000000"/>
+          <w:sz w:val="24"/>
+          <w:szCs w:val="24"/>
+        </w:rPr>
+      </w:pPr>
+      <w:r>
+        <w:rPr>
+          <w:rFonts w:ascii="Times New Roman" w:eastAsia="Arial" w:hAnsi="Times New Roman" w:cs="Times New Roman"/>
+          <w:color w:val="000000"/>
+          <w:sz w:val="24"/>
+          <w:szCs w:val="24"/>
+        </w:rPr>
+        <w:t>Iniciar sesión</w:t>
+      </w:r>
+    </w:p>
+    <w:tbl>
+      <w:tblPr>
+        <w:tblStyle w:val="Tablaconcuadrcula"/>
+        <w:tblW w:w="0" w:type="auto"/>
+        <w:tblInd w:w="720" w:type="dxa"/>
+        <w:tblLook w:val="04A0" w:firstRow="1" w:lastRow="0" w:firstColumn="1" w:lastColumn="0" w:noHBand="0" w:noVBand="1"/>
+      </w:tblPr>
+      <w:tblGrid>
+        <w:gridCol w:w="4148"/>
+        <w:gridCol w:w="4148"/>
+      </w:tblGrid>
+      <w:tr>
+        <w:tc>
+          <w:tcPr>
+            <w:tcW w:w="4148" w:type="dxa"/>
+            <w:shd w:val="clear" w:color="auto" w:fill="DBE5F1" w:themeFill="accent1" w:themeFillTint="33"/>
+          </w:tcPr>
+          <w:p>
+            <w:pPr>
+              <w:pStyle w:val="Prrafodelista"/>
+              <w:spacing w:line="360" w:lineRule="auto"/>
+              <w:ind w:left="0"/>
+              <w:jc w:val="center"/>
+              <w:rPr>
+                <w:rFonts w:ascii="Times New Roman" w:eastAsia="Arial" w:hAnsi="Times New Roman" w:cs="Times New Roman"/>
+                <w:b/>
+                <w:bCs/>
+                <w:color w:val="000000"/>
+                <w:sz w:val="24"/>
+                <w:szCs w:val="24"/>
+              </w:rPr>
+            </w:pPr>
+            <w:r>
+              <w:rPr>
+                <w:rFonts w:ascii="Times New Roman" w:eastAsia="Arial" w:hAnsi="Times New Roman" w:cs="Times New Roman"/>
+                <w:b/>
+                <w:bCs/>
+                <w:color w:val="000000"/>
+                <w:sz w:val="24"/>
+                <w:szCs w:val="24"/>
+              </w:rPr>
+              <w:t>DESCRIPCIÓN</w:t>
+            </w:r>
+          </w:p>
+        </w:tc>
+        <w:tc>
+          <w:tcPr>
+            <w:tcW w:w="4148" w:type="dxa"/>
+            <w:shd w:val="clear" w:color="auto" w:fill="F2DBDB" w:themeFill="accent2" w:themeFillTint="33"/>
+          </w:tcPr>
+          <w:p>
+            <w:pPr>
+              <w:pStyle w:val="Prrafodelista"/>
+              <w:spacing w:line="360" w:lineRule="auto"/>
+              <w:ind w:left="0"/>
+              <w:jc w:val="center"/>
+              <w:rPr>
+                <w:rFonts w:ascii="Times New Roman" w:eastAsia="Arial" w:hAnsi="Times New Roman" w:cs="Times New Roman"/>
+                <w:color w:val="000000"/>
+                <w:sz w:val="24"/>
+                <w:szCs w:val="24"/>
+              </w:rPr>
+            </w:pPr>
+            <w:r>
+              <w:rPr>
+                <w:rFonts w:ascii="Times New Roman" w:eastAsia="Arial" w:hAnsi="Times New Roman" w:cs="Times New Roman"/>
+                <w:color w:val="000000"/>
+                <w:sz w:val="24"/>
+                <w:szCs w:val="24"/>
+              </w:rPr>
+              <w:t>El usuario introduce su email y contraseña para acceder a la plataforma</w:t>
+            </w:r>
+          </w:p>
+        </w:tc>
+      </w:tr>
+      <w:tr>
+        <w:tc>
+          <w:tcPr>
+            <w:tcW w:w="4148" w:type="dxa"/>
+            <w:shd w:val="clear" w:color="auto" w:fill="DBE5F1" w:themeFill="accent1" w:themeFillTint="33"/>
+          </w:tcPr>
+          <w:p>
+            <w:pPr>
+              <w:pStyle w:val="Prrafodelista"/>
+              <w:spacing w:line="360" w:lineRule="auto"/>
+              <w:ind w:left="0"/>
+              <w:jc w:val="center"/>
+              <w:rPr>
+                <w:rFonts w:ascii="Times New Roman" w:eastAsia="Arial" w:hAnsi="Times New Roman" w:cs="Times New Roman"/>
+                <w:b/>
+                <w:bCs/>
+                <w:color w:val="000000"/>
+                <w:sz w:val="24"/>
+                <w:szCs w:val="24"/>
+              </w:rPr>
+            </w:pPr>
+            <w:r>
+              <w:rPr>
+                <w:rFonts w:ascii="Times New Roman" w:eastAsia="Arial" w:hAnsi="Times New Roman" w:cs="Times New Roman"/>
+                <w:b/>
+                <w:bCs/>
+                <w:color w:val="000000"/>
+                <w:sz w:val="24"/>
+                <w:szCs w:val="24"/>
+              </w:rPr>
+              <w:t>PRECONDICIONES</w:t>
+            </w:r>
+          </w:p>
+        </w:tc>
+        <w:tc>
+          <w:tcPr>
+            <w:tcW w:w="4148" w:type="dxa"/>
+            <w:shd w:val="clear" w:color="auto" w:fill="F2DBDB" w:themeFill="accent2" w:themeFillTint="33"/>
+          </w:tcPr>
+          <w:p>
+            <w:pPr>
+              <w:pStyle w:val="Prrafodelista"/>
+              <w:spacing w:line="360" w:lineRule="auto"/>
+              <w:ind w:left="0"/>
+              <w:jc w:val="center"/>
+              <w:rPr>
+                <w:rFonts w:ascii="Times New Roman" w:eastAsia="Arial" w:hAnsi="Times New Roman" w:cs="Times New Roman"/>
+                <w:color w:val="000000"/>
+                <w:sz w:val="24"/>
+                <w:szCs w:val="24"/>
+              </w:rPr>
+            </w:pPr>
+            <w:r>
+              <w:rPr>
+                <w:rFonts w:ascii="Times New Roman" w:eastAsia="Arial" w:hAnsi="Times New Roman" w:cs="Times New Roman"/>
+                <w:color w:val="000000"/>
+                <w:sz w:val="24"/>
+                <w:szCs w:val="24"/>
+              </w:rPr>
+              <w:t>El usuario debe estar registrado previamente en el sistema</w:t>
+            </w:r>
+          </w:p>
+        </w:tc>
+      </w:tr>
+      <w:tr>
+        <w:tc>
+          <w:tcPr>
+            <w:tcW w:w="4148" w:type="dxa"/>
+            <w:shd w:val="clear" w:color="auto" w:fill="DBE5F1" w:themeFill="accent1" w:themeFillTint="33"/>
+          </w:tcPr>
+          <w:p>
+            <w:pPr>
+              <w:pStyle w:val="Prrafodelista"/>
+              <w:spacing w:line="360" w:lineRule="auto"/>
+              <w:ind w:left="0"/>
+              <w:jc w:val="center"/>
+              <w:rPr>
+                <w:rFonts w:ascii="Times New Roman" w:eastAsia="Arial" w:hAnsi="Times New Roman" w:cs="Times New Roman"/>
+                <w:b/>
+                <w:bCs/>
+                <w:color w:val="000000"/>
+                <w:sz w:val="24"/>
+                <w:szCs w:val="24"/>
+              </w:rPr>
+            </w:pPr>
+            <w:r>
+              <w:rPr>
+                <w:rFonts w:ascii="Times New Roman" w:eastAsia="Arial" w:hAnsi="Times New Roman" w:cs="Times New Roman"/>
+                <w:b/>
+                <w:bCs/>
+                <w:color w:val="000000"/>
+                <w:sz w:val="24"/>
+                <w:szCs w:val="24"/>
+              </w:rPr>
+              <w:t>POSTCONDICIONES</w:t>
+            </w:r>
+          </w:p>
+        </w:tc>
+        <w:tc>
+          <w:tcPr>
+            <w:tcW w:w="4148" w:type="dxa"/>
+            <w:shd w:val="clear" w:color="auto" w:fill="F2DBDB" w:themeFill="accent2" w:themeFillTint="33"/>
+          </w:tcPr>
+          <w:p>
+            <w:pPr>
+              <w:pStyle w:val="Prrafodelista"/>
+              <w:spacing w:line="360" w:lineRule="auto"/>
+              <w:ind w:left="0"/>
+              <w:jc w:val="center"/>
+              <w:rPr>
+                <w:rFonts w:ascii="Times New Roman" w:eastAsia="Arial" w:hAnsi="Times New Roman" w:cs="Times New Roman"/>
+                <w:color w:val="000000"/>
+                <w:sz w:val="24"/>
+                <w:szCs w:val="24"/>
+              </w:rPr>
+            </w:pPr>
+            <w:r>
+              <w:rPr>
+                <w:rFonts w:ascii="Times New Roman" w:eastAsia="Arial" w:hAnsi="Times New Roman" w:cs="Times New Roman"/>
+                <w:color w:val="000000"/>
+                <w:sz w:val="24"/>
+                <w:szCs w:val="24"/>
+              </w:rPr>
+              <w:t>Se genera un token JWT y el usuario obtiene acceso al catálogo de libros</w:t>
+            </w:r>
+          </w:p>
+        </w:tc>
+      </w:tr>
+      <w:tr>
+        <w:tc>
+          <w:tcPr>
+            <w:tcW w:w="4148" w:type="dxa"/>
+            <w:shd w:val="clear" w:color="auto" w:fill="DBE5F1" w:themeFill="accent1" w:themeFillTint="33"/>
+          </w:tcPr>
+          <w:p>
+            <w:pPr>
+              <w:pStyle w:val="Prrafodelista"/>
+              <w:spacing w:line="360" w:lineRule="auto"/>
+              <w:ind w:left="0"/>
+              <w:jc w:val="center"/>
+              <w:rPr>
+                <w:rFonts w:ascii="Times New Roman" w:eastAsia="Arial" w:hAnsi="Times New Roman" w:cs="Times New Roman"/>
+                <w:b/>
+                <w:bCs/>
+                <w:color w:val="000000"/>
+                <w:sz w:val="24"/>
+                <w:szCs w:val="24"/>
+              </w:rPr>
+            </w:pPr>
+            <w:r>
+              <w:rPr>
+                <w:rFonts w:ascii="Times New Roman" w:eastAsia="Arial" w:hAnsi="Times New Roman" w:cs="Times New Roman"/>
+                <w:b/>
+                <w:bCs/>
+                <w:color w:val="000000"/>
+                <w:sz w:val="24"/>
+                <w:szCs w:val="24"/>
+              </w:rPr>
+              <w:t>DATOS DE ENTRADA</w:t>
+            </w:r>
+          </w:p>
+        </w:tc>
+        <w:tc>
+          <w:tcPr>
+            <w:tcW w:w="4148" w:type="dxa"/>
+            <w:shd w:val="clear" w:color="auto" w:fill="F2DBDB" w:themeFill="accent2" w:themeFillTint="33"/>
+          </w:tcPr>
+          <w:p>
+            <w:pPr>
+              <w:pStyle w:val="Prrafodelista"/>
+              <w:spacing w:line="360" w:lineRule="auto"/>
+              <w:ind w:left="0"/>
+              <w:jc w:val="center"/>
+              <w:rPr>
+                <w:rFonts w:ascii="Times New Roman" w:eastAsia="Arial" w:hAnsi="Times New Roman" w:cs="Times New Roman"/>
+                <w:color w:val="000000"/>
+                <w:sz w:val="24"/>
+                <w:szCs w:val="24"/>
+              </w:rPr>
+            </w:pPr>
+            <w:r>
+              <w:rPr>
+                <w:rFonts w:ascii="Times New Roman" w:eastAsia="Arial" w:hAnsi="Times New Roman" w:cs="Times New Roman"/>
+                <w:color w:val="000000"/>
+                <w:sz w:val="24"/>
+                <w:szCs w:val="24"/>
+              </w:rPr>
+              <w:t>Email y contraseña</w:t>
+            </w:r>
+          </w:p>
+        </w:tc>
+      </w:tr>
+      <w:tr>
+        <w:tc>
+          <w:tcPr>
+            <w:tcW w:w="4148" w:type="dxa"/>
+            <w:shd w:val="clear" w:color="auto" w:fill="DBE5F1" w:themeFill="accent1" w:themeFillTint="33"/>
+          </w:tcPr>
+          <w:p>
+            <w:pPr>
+              <w:pStyle w:val="Prrafodelista"/>
+              <w:spacing w:line="360" w:lineRule="auto"/>
+              <w:ind w:left="0"/>
+              <w:jc w:val="center"/>
+              <w:rPr>
+                <w:rFonts w:ascii="Times New Roman" w:eastAsia="Arial" w:hAnsi="Times New Roman" w:cs="Times New Roman"/>
+                <w:b/>
+                <w:bCs/>
+                <w:color w:val="000000"/>
+                <w:sz w:val="24"/>
+                <w:szCs w:val="24"/>
+              </w:rPr>
+            </w:pPr>
+            <w:r>
+              <w:rPr>
+                <w:rFonts w:ascii="Times New Roman" w:eastAsia="Arial" w:hAnsi="Times New Roman" w:cs="Times New Roman"/>
+                <w:b/>
+                <w:bCs/>
+                <w:color w:val="000000"/>
+                <w:sz w:val="24"/>
+                <w:szCs w:val="24"/>
+              </w:rPr>
+              <w:t>DATOS DE SALIDA</w:t>
+            </w:r>
+          </w:p>
+        </w:tc>
+        <w:tc>
+          <w:tcPr>
+            <w:tcW w:w="4148" w:type="dxa"/>
+            <w:shd w:val="clear" w:color="auto" w:fill="F2DBDB" w:themeFill="accent2" w:themeFillTint="33"/>
+          </w:tcPr>
+          <w:p>
+            <w:pPr>
+              <w:pStyle w:val="Prrafodelista"/>
+              <w:spacing w:line="360" w:lineRule="auto"/>
+              <w:ind w:left="0"/>
+              <w:jc w:val="center"/>
+              <w:rPr>
+                <w:rFonts w:ascii="Times New Roman" w:eastAsia="Arial" w:hAnsi="Times New Roman" w:cs="Times New Roman"/>
+                <w:color w:val="000000"/>
+                <w:sz w:val="24"/>
+                <w:szCs w:val="24"/>
+              </w:rPr>
+            </w:pPr>
+            <w:r>
+              <w:rPr>
+                <w:rFonts w:ascii="Times New Roman" w:eastAsia="Arial" w:hAnsi="Times New Roman" w:cs="Times New Roman"/>
+                <w:color w:val="000000"/>
+                <w:sz w:val="24"/>
+                <w:szCs w:val="24"/>
+              </w:rPr>
+              <w:t>Token JWT y mensaje de confirmación</w:t>
+            </w:r>
+          </w:p>
+        </w:tc>
+      </w:tr>
+      <w:tr>
+        <w:tc>
+          <w:tcPr>
+            <w:tcW w:w="4148" w:type="dxa"/>
+            <w:shd w:val="clear" w:color="auto" w:fill="DBE5F1" w:themeFill="accent1" w:themeFillTint="33"/>
+          </w:tcPr>
+          <w:p>
+            <w:pPr>
+              <w:pStyle w:val="Prrafodelista"/>
+              <w:spacing w:line="360" w:lineRule="auto"/>
+              <w:ind w:left="0"/>
+              <w:jc w:val="center"/>
+              <w:rPr>
+                <w:rFonts w:ascii="Times New Roman" w:eastAsia="Arial" w:hAnsi="Times New Roman" w:cs="Times New Roman"/>
+                <w:b/>
+                <w:bCs/>
+                <w:color w:val="000000"/>
+                <w:sz w:val="24"/>
+                <w:szCs w:val="24"/>
+              </w:rPr>
+            </w:pPr>
+            <w:r>
+              <w:rPr>
+                <w:rFonts w:ascii="Times New Roman" w:eastAsia="Arial" w:hAnsi="Times New Roman" w:cs="Times New Roman"/>
+                <w:b/>
+                <w:bCs/>
+                <w:color w:val="000000"/>
+                <w:sz w:val="24"/>
+                <w:szCs w:val="24"/>
+              </w:rPr>
+              <w:t>TABLAS</w:t>
+            </w:r>
+          </w:p>
+        </w:tc>
+        <w:tc>
+          <w:tcPr>
+            <w:tcW w:w="4148" w:type="dxa"/>
+            <w:shd w:val="clear" w:color="auto" w:fill="F2DBDB" w:themeFill="accent2" w:themeFillTint="33"/>
+          </w:tcPr>
+          <w:p>
+            <w:pPr>
+              <w:pStyle w:val="Prrafodelista"/>
+              <w:spacing w:line="360" w:lineRule="auto"/>
+              <w:ind w:left="0"/>
+              <w:jc w:val="center"/>
+              <w:rPr>
+                <w:rFonts w:ascii="Times New Roman" w:eastAsia="Arial" w:hAnsi="Times New Roman" w:cs="Times New Roman"/>
+                <w:color w:val="000000"/>
+                <w:sz w:val="24"/>
+                <w:szCs w:val="24"/>
+              </w:rPr>
+            </w:pPr>
+            <w:r>
+              <w:rPr>
+                <w:rFonts w:ascii="Times New Roman" w:eastAsia="Arial" w:hAnsi="Times New Roman" w:cs="Times New Roman"/>
+                <w:color w:val="000000"/>
+                <w:sz w:val="24"/>
+                <w:szCs w:val="24"/>
+              </w:rPr>
+              <w:t>Usuarios</w:t>
+            </w:r>
+          </w:p>
+        </w:tc>
+      </w:tr>
+      <w:tr>
+        <w:tc>
+          <w:tcPr>
+            <w:tcW w:w="4148" w:type="dxa"/>
+            <w:shd w:val="clear" w:color="auto" w:fill="DBE5F1" w:themeFill="accent1" w:themeFillTint="33"/>
+          </w:tcPr>
+          <w:p>
+            <w:pPr>
+              <w:pStyle w:val="Prrafodelista"/>
+              <w:spacing w:line="360" w:lineRule="auto"/>
+              <w:ind w:left="0"/>
+              <w:jc w:val="center"/>
+              <w:rPr>
+                <w:rFonts w:ascii="Times New Roman" w:eastAsia="Arial" w:hAnsi="Times New Roman" w:cs="Times New Roman"/>
+                <w:b/>
+                <w:bCs/>
+                <w:color w:val="000000"/>
+                <w:sz w:val="24"/>
+                <w:szCs w:val="24"/>
+              </w:rPr>
+            </w:pPr>
+            <w:r>
+              <w:rPr>
+                <w:rFonts w:ascii="Times New Roman" w:eastAsia="Arial" w:hAnsi="Times New Roman" w:cs="Times New Roman"/>
+                <w:b/>
+                <w:bCs/>
+                <w:color w:val="000000"/>
+                <w:sz w:val="24"/>
+                <w:szCs w:val="24"/>
+              </w:rPr>
+              <w:t>INTERFACES</w:t>
+            </w:r>
+          </w:p>
+        </w:tc>
+        <w:tc>
+          <w:tcPr>
+            <w:tcW w:w="4148" w:type="dxa"/>
+            <w:shd w:val="clear" w:color="auto" w:fill="F2DBDB" w:themeFill="accent2" w:themeFillTint="33"/>
+          </w:tcPr>
+          <w:p>
+            <w:pPr>
+              <w:pStyle w:val="Prrafodelista"/>
+              <w:spacing w:line="360" w:lineRule="auto"/>
+              <w:ind w:left="0"/>
+              <w:jc w:val="center"/>
+              <w:rPr>
+                <w:rFonts w:ascii="Times New Roman" w:eastAsia="Arial" w:hAnsi="Times New Roman" w:cs="Times New Roman"/>
+                <w:color w:val="000000"/>
+                <w:sz w:val="24"/>
+                <w:szCs w:val="24"/>
+              </w:rPr>
+            </w:pPr>
+            <w:r>
+              <w:rPr>
+                <w:rFonts w:ascii="Times New Roman" w:eastAsia="Arial" w:hAnsi="Times New Roman" w:cs="Times New Roman"/>
+                <w:color w:val="000000"/>
+                <w:sz w:val="24"/>
+                <w:szCs w:val="24"/>
+              </w:rPr>
+              <w:t>Login.html</w:t>
+            </w:r>
+          </w:p>
+        </w:tc>
+      </w:tr>
+    </w:tbl>
+    <w:p>
+      <w:pPr>
+        <w:pStyle w:val="Prrafodelista"/>
+        <w:spacing w:line="360" w:lineRule="auto"/>
+        <w:jc w:val="both"/>
+        <w:rPr>
+          <w:rFonts w:ascii="Times New Roman" w:eastAsia="Arial" w:hAnsi="Times New Roman" w:cs="Times New Roman"/>
+          <w:color w:val="000000"/>
+          <w:sz w:val="24"/>
+          <w:szCs w:val="24"/>
+        </w:rPr>
+      </w:pPr>
+    </w:p>
+    <w:p>
+      <w:pPr>
+        <w:pStyle w:val="Prrafodelista"/>
+        <w:spacing w:line="360" w:lineRule="auto"/>
+        <w:jc w:val="both"/>
+        <w:rPr>
+          <w:rFonts w:ascii="Times New Roman" w:eastAsia="Arial" w:hAnsi="Times New Roman" w:cs="Times New Roman"/>
+          <w:color w:val="000000"/>
+          <w:sz w:val="24"/>
+          <w:szCs w:val="24"/>
+        </w:rPr>
+      </w:pPr>
+    </w:p>
+    <w:p>
+      <w:pPr>
+        <w:pStyle w:val="Prrafodelista"/>
+        <w:spacing w:line="360" w:lineRule="auto"/>
+        <w:jc w:val="both"/>
+        <w:rPr>
+          <w:rFonts w:ascii="Times New Roman" w:eastAsia="Arial" w:hAnsi="Times New Roman" w:cs="Times New Roman"/>
+          <w:color w:val="000000"/>
+          <w:sz w:val="24"/>
+          <w:szCs w:val="24"/>
+        </w:rPr>
+      </w:pPr>
+    </w:p>
+    <w:p>
+      <w:pPr>
+        <w:pStyle w:val="Prrafodelista"/>
+        <w:spacing w:line="360" w:lineRule="auto"/>
+        <w:jc w:val="both"/>
+        <w:rPr>
+          <w:rFonts w:ascii="Times New Roman" w:eastAsia="Arial" w:hAnsi="Times New Roman" w:cs="Times New Roman"/>
+          <w:color w:val="000000"/>
+          <w:sz w:val="24"/>
+          <w:szCs w:val="24"/>
+        </w:rPr>
+      </w:pPr>
+    </w:p>
+    <w:p>
+      <w:pPr>
+        <w:pStyle w:val="Prrafodelista"/>
+        <w:spacing w:line="360" w:lineRule="auto"/>
+        <w:jc w:val="both"/>
+        <w:rPr>
+          <w:rFonts w:ascii="Times New Roman" w:eastAsia="Arial" w:hAnsi="Times New Roman" w:cs="Times New Roman"/>
+          <w:color w:val="000000"/>
+          <w:sz w:val="24"/>
+          <w:szCs w:val="24"/>
+        </w:rPr>
+      </w:pPr>
+    </w:p>
+    <w:p>
+      <w:pPr>
+        <w:pStyle w:val="Prrafodelista"/>
+        <w:spacing w:line="360" w:lineRule="auto"/>
+        <w:jc w:val="both"/>
+        <w:rPr>
+          <w:rFonts w:ascii="Times New Roman" w:eastAsia="Arial" w:hAnsi="Times New Roman" w:cs="Times New Roman"/>
+          <w:color w:val="000000"/>
+          <w:sz w:val="24"/>
+          <w:szCs w:val="24"/>
+        </w:rPr>
+      </w:pPr>
+    </w:p>
+    <w:p>
+      <w:pPr>
+        <w:pStyle w:val="Prrafodelista"/>
+        <w:numPr>
+          <w:ilvl w:val="0"/>
+          <w:numId w:val="6"/>
+        </w:numPr>
+        <w:spacing w:line="360" w:lineRule="auto"/>
+        <w:jc w:val="both"/>
+        <w:rPr>
+          <w:rFonts w:ascii="Times New Roman" w:eastAsia="Arial" w:hAnsi="Times New Roman" w:cs="Times New Roman"/>
+          <w:color w:val="000000"/>
+          <w:sz w:val="24"/>
+          <w:szCs w:val="24"/>
+        </w:rPr>
+      </w:pPr>
+      <w:r>
+        <w:rPr>
+          <w:rFonts w:ascii="Times New Roman" w:eastAsia="Arial" w:hAnsi="Times New Roman" w:cs="Times New Roman"/>
+          <w:color w:val="000000"/>
+          <w:sz w:val="24"/>
+          <w:szCs w:val="24"/>
+        </w:rPr>
+        <w:lastRenderedPageBreak/>
+        <w:t>Solicitar préstamo</w:t>
+      </w:r>
+    </w:p>
+    <w:tbl>
+      <w:tblPr>
+        <w:tblStyle w:val="Tablaconcuadrcula"/>
+        <w:tblW w:w="0" w:type="auto"/>
+        <w:tblInd w:w="720" w:type="dxa"/>
+        <w:tblLook w:val="04A0" w:firstRow="1" w:lastRow="0" w:firstColumn="1" w:lastColumn="0" w:noHBand="0" w:noVBand="1"/>
+      </w:tblPr>
+      <w:tblGrid>
+        <w:gridCol w:w="4148"/>
+        <w:gridCol w:w="4148"/>
+      </w:tblGrid>
+      <w:tr>
+        <w:tc>
+          <w:tcPr>
+            <w:tcW w:w="4148" w:type="dxa"/>
+            <w:shd w:val="clear" w:color="auto" w:fill="DBE5F1" w:themeFill="accent1" w:themeFillTint="33"/>
+          </w:tcPr>
+          <w:p>
+            <w:pPr>
+              <w:pStyle w:val="Prrafodelista"/>
+              <w:spacing w:line="360" w:lineRule="auto"/>
+              <w:ind w:left="0"/>
+              <w:jc w:val="center"/>
+              <w:rPr>
+                <w:rFonts w:ascii="Times New Roman" w:eastAsia="Arial" w:hAnsi="Times New Roman" w:cs="Times New Roman"/>
+                <w:b/>
+                <w:bCs/>
+                <w:color w:val="000000"/>
+                <w:sz w:val="24"/>
+                <w:szCs w:val="24"/>
+              </w:rPr>
+            </w:pPr>
+            <w:r>
+              <w:rPr>
+                <w:rFonts w:ascii="Times New Roman" w:eastAsia="Arial" w:hAnsi="Times New Roman" w:cs="Times New Roman"/>
+                <w:b/>
+                <w:bCs/>
+                <w:color w:val="000000"/>
+                <w:sz w:val="24"/>
+                <w:szCs w:val="24"/>
+              </w:rPr>
+              <w:t>DESCRIPCIÓN</w:t>
+            </w:r>
+          </w:p>
+        </w:tc>
+        <w:tc>
+          <w:tcPr>
+            <w:tcW w:w="4148" w:type="dxa"/>
+            <w:shd w:val="clear" w:color="auto" w:fill="F2DBDB" w:themeFill="accent2" w:themeFillTint="33"/>
+          </w:tcPr>
+          <w:p>
+            <w:pPr>
+              <w:pStyle w:val="Prrafodelista"/>
+              <w:spacing w:line="360" w:lineRule="auto"/>
+              <w:ind w:left="0"/>
+              <w:jc w:val="center"/>
+              <w:rPr>
+                <w:rFonts w:ascii="Times New Roman" w:eastAsia="Arial" w:hAnsi="Times New Roman" w:cs="Times New Roman"/>
+                <w:color w:val="000000"/>
+                <w:sz w:val="24"/>
+                <w:szCs w:val="24"/>
+              </w:rPr>
+            </w:pPr>
+            <w:r>
+              <w:rPr>
+                <w:rFonts w:ascii="Times New Roman" w:eastAsia="Arial" w:hAnsi="Times New Roman" w:cs="Times New Roman"/>
+                <w:color w:val="000000"/>
+                <w:sz w:val="24"/>
+                <w:szCs w:val="24"/>
+              </w:rPr>
+              <w:t>El usuario solicita el préstamo de un libro que figura como disponible en el catálogo</w:t>
+            </w:r>
+          </w:p>
+        </w:tc>
+      </w:tr>
+      <w:tr>
+        <w:tc>
+          <w:tcPr>
+            <w:tcW w:w="4148" w:type="dxa"/>
+            <w:shd w:val="clear" w:color="auto" w:fill="DBE5F1" w:themeFill="accent1" w:themeFillTint="33"/>
+          </w:tcPr>
+          <w:p>
+            <w:pPr>
+              <w:pStyle w:val="Prrafodelista"/>
+              <w:spacing w:line="360" w:lineRule="auto"/>
+              <w:ind w:left="0"/>
+              <w:jc w:val="center"/>
+              <w:rPr>
+                <w:rFonts w:ascii="Times New Roman" w:eastAsia="Arial" w:hAnsi="Times New Roman" w:cs="Times New Roman"/>
+                <w:b/>
+                <w:bCs/>
+                <w:color w:val="000000"/>
+                <w:sz w:val="24"/>
+                <w:szCs w:val="24"/>
+              </w:rPr>
+            </w:pPr>
+            <w:r>
+              <w:rPr>
+                <w:rFonts w:ascii="Times New Roman" w:eastAsia="Arial" w:hAnsi="Times New Roman" w:cs="Times New Roman"/>
+                <w:b/>
+                <w:bCs/>
+                <w:color w:val="000000"/>
+                <w:sz w:val="24"/>
+                <w:szCs w:val="24"/>
+              </w:rPr>
+              <w:t>PRECONDICIONES</w:t>
+            </w:r>
+          </w:p>
+        </w:tc>
+        <w:tc>
+          <w:tcPr>
+            <w:tcW w:w="4148" w:type="dxa"/>
+            <w:shd w:val="clear" w:color="auto" w:fill="F2DBDB" w:themeFill="accent2" w:themeFillTint="33"/>
+          </w:tcPr>
+          <w:p>
+            <w:pPr>
+              <w:pStyle w:val="Prrafodelista"/>
+              <w:spacing w:line="360" w:lineRule="auto"/>
+              <w:ind w:left="0"/>
+              <w:jc w:val="center"/>
+              <w:rPr>
+                <w:rFonts w:ascii="Times New Roman" w:eastAsia="Arial" w:hAnsi="Times New Roman" w:cs="Times New Roman"/>
+                <w:color w:val="000000"/>
+                <w:sz w:val="24"/>
+                <w:szCs w:val="24"/>
+              </w:rPr>
+            </w:pPr>
+            <w:r>
+              <w:rPr>
+                <w:rFonts w:ascii="Times New Roman" w:eastAsia="Arial" w:hAnsi="Times New Roman" w:cs="Times New Roman"/>
+                <w:color w:val="000000"/>
+                <w:sz w:val="24"/>
+                <w:szCs w:val="24"/>
+              </w:rPr>
+              <w:t>El usuario debe haber iniciado sesión y el libro debe aparecer como disponible</w:t>
+            </w:r>
+          </w:p>
+        </w:tc>
+      </w:tr>
+      <w:tr>
+        <w:tc>
+          <w:tcPr>
+            <w:tcW w:w="4148" w:type="dxa"/>
+            <w:shd w:val="clear" w:color="auto" w:fill="DBE5F1" w:themeFill="accent1" w:themeFillTint="33"/>
+          </w:tcPr>
+          <w:p>
+            <w:pPr>
+              <w:pStyle w:val="Prrafodelista"/>
+              <w:spacing w:line="360" w:lineRule="auto"/>
+              <w:ind w:left="0"/>
+              <w:jc w:val="center"/>
+              <w:rPr>
+                <w:rFonts w:ascii="Times New Roman" w:eastAsia="Arial" w:hAnsi="Times New Roman" w:cs="Times New Roman"/>
+                <w:b/>
+                <w:bCs/>
+                <w:color w:val="000000"/>
+                <w:sz w:val="24"/>
+                <w:szCs w:val="24"/>
+              </w:rPr>
+            </w:pPr>
+            <w:r>
+              <w:rPr>
+                <w:rFonts w:ascii="Times New Roman" w:eastAsia="Arial" w:hAnsi="Times New Roman" w:cs="Times New Roman"/>
+                <w:b/>
+                <w:bCs/>
+                <w:color w:val="000000"/>
+                <w:sz w:val="24"/>
+                <w:szCs w:val="24"/>
+              </w:rPr>
+              <w:t>POSTCONDICIONES</w:t>
+            </w:r>
+          </w:p>
+        </w:tc>
+        <w:tc>
+          <w:tcPr>
+            <w:tcW w:w="4148" w:type="dxa"/>
+            <w:shd w:val="clear" w:color="auto" w:fill="F2DBDB" w:themeFill="accent2" w:themeFillTint="33"/>
+          </w:tcPr>
+          <w:p>
+            <w:pPr>
+              <w:pStyle w:val="Prrafodelista"/>
+              <w:spacing w:line="360" w:lineRule="auto"/>
+              <w:ind w:left="0"/>
+              <w:jc w:val="center"/>
+              <w:rPr>
+                <w:rFonts w:ascii="Times New Roman" w:eastAsia="Arial" w:hAnsi="Times New Roman" w:cs="Times New Roman"/>
+                <w:color w:val="000000"/>
+                <w:sz w:val="24"/>
+                <w:szCs w:val="24"/>
+              </w:rPr>
+            </w:pPr>
+            <w:r>
+              <w:rPr>
+                <w:rFonts w:ascii="Times New Roman" w:eastAsia="Arial" w:hAnsi="Times New Roman" w:cs="Times New Roman"/>
+                <w:color w:val="000000"/>
+                <w:sz w:val="24"/>
+                <w:szCs w:val="24"/>
+              </w:rPr>
+              <w:t>Se registra el préstamo con fecha de vencimiento a 20 días y el libro se marca como No disponible</w:t>
+            </w:r>
+          </w:p>
+        </w:tc>
+      </w:tr>
+      <w:tr>
+        <w:tc>
+          <w:tcPr>
+            <w:tcW w:w="4148" w:type="dxa"/>
+            <w:shd w:val="clear" w:color="auto" w:fill="DBE5F1" w:themeFill="accent1" w:themeFillTint="33"/>
+          </w:tcPr>
+          <w:p>
+            <w:pPr>
+              <w:pStyle w:val="Prrafodelista"/>
+              <w:spacing w:line="360" w:lineRule="auto"/>
+              <w:ind w:left="0"/>
+              <w:jc w:val="center"/>
+              <w:rPr>
+                <w:rFonts w:ascii="Times New Roman" w:eastAsia="Arial" w:hAnsi="Times New Roman" w:cs="Times New Roman"/>
+                <w:b/>
+                <w:bCs/>
+                <w:color w:val="000000"/>
+                <w:sz w:val="24"/>
+                <w:szCs w:val="24"/>
+              </w:rPr>
+            </w:pPr>
+            <w:r>
+              <w:rPr>
+                <w:rFonts w:ascii="Times New Roman" w:eastAsia="Arial" w:hAnsi="Times New Roman" w:cs="Times New Roman"/>
+                <w:b/>
+                <w:bCs/>
+                <w:color w:val="000000"/>
+                <w:sz w:val="24"/>
+                <w:szCs w:val="24"/>
+              </w:rPr>
+              <w:t>DATOS DE ENTRADA</w:t>
+            </w:r>
+          </w:p>
+        </w:tc>
+        <w:tc>
+          <w:tcPr>
+            <w:tcW w:w="4148" w:type="dxa"/>
+            <w:shd w:val="clear" w:color="auto" w:fill="F2DBDB" w:themeFill="accent2" w:themeFillTint="33"/>
+          </w:tcPr>
+          <w:p>
+            <w:pPr>
+              <w:pStyle w:val="Prrafodelista"/>
+              <w:spacing w:line="360" w:lineRule="auto"/>
+              <w:ind w:left="0"/>
+              <w:jc w:val="center"/>
+              <w:rPr>
+                <w:rFonts w:ascii="Times New Roman" w:eastAsia="Arial" w:hAnsi="Times New Roman" w:cs="Times New Roman"/>
+                <w:color w:val="000000"/>
+                <w:sz w:val="24"/>
+                <w:szCs w:val="24"/>
+              </w:rPr>
+            </w:pPr>
+            <w:proofErr w:type="spellStart"/>
+            <w:r>
+              <w:rPr>
+                <w:rFonts w:ascii="Times New Roman" w:eastAsia="Arial" w:hAnsi="Times New Roman" w:cs="Times New Roman"/>
+                <w:color w:val="000000"/>
+                <w:sz w:val="24"/>
+                <w:szCs w:val="24"/>
+              </w:rPr>
+              <w:t>Id_libro</w:t>
+            </w:r>
+            <w:proofErr w:type="spellEnd"/>
+            <w:r>
+              <w:rPr>
+                <w:rFonts w:ascii="Times New Roman" w:eastAsia="Arial" w:hAnsi="Times New Roman" w:cs="Times New Roman"/>
+                <w:color w:val="000000"/>
+                <w:sz w:val="24"/>
+                <w:szCs w:val="24"/>
+              </w:rPr>
+              <w:t xml:space="preserve"> y token JWT</w:t>
+            </w:r>
+          </w:p>
+        </w:tc>
+      </w:tr>
+      <w:tr>
+        <w:tc>
+          <w:tcPr>
+            <w:tcW w:w="4148" w:type="dxa"/>
+            <w:shd w:val="clear" w:color="auto" w:fill="DBE5F1" w:themeFill="accent1" w:themeFillTint="33"/>
+          </w:tcPr>
+          <w:p>
+            <w:pPr>
+              <w:pStyle w:val="Prrafodelista"/>
+              <w:spacing w:line="360" w:lineRule="auto"/>
+              <w:ind w:left="0"/>
+              <w:jc w:val="center"/>
+              <w:rPr>
+                <w:rFonts w:ascii="Times New Roman" w:eastAsia="Arial" w:hAnsi="Times New Roman" w:cs="Times New Roman"/>
+                <w:b/>
+                <w:bCs/>
+                <w:color w:val="000000"/>
+                <w:sz w:val="24"/>
+                <w:szCs w:val="24"/>
+              </w:rPr>
+            </w:pPr>
+            <w:r>
+              <w:rPr>
+                <w:rFonts w:ascii="Times New Roman" w:eastAsia="Arial" w:hAnsi="Times New Roman" w:cs="Times New Roman"/>
+                <w:b/>
+                <w:bCs/>
+                <w:color w:val="000000"/>
+                <w:sz w:val="24"/>
+                <w:szCs w:val="24"/>
+              </w:rPr>
+              <w:t>DATOS DE SALIDA</w:t>
+            </w:r>
+          </w:p>
+        </w:tc>
+        <w:tc>
+          <w:tcPr>
+            <w:tcW w:w="4148" w:type="dxa"/>
+            <w:shd w:val="clear" w:color="auto" w:fill="F2DBDB" w:themeFill="accent2" w:themeFillTint="33"/>
+          </w:tcPr>
+          <w:p>
+            <w:pPr>
+              <w:pStyle w:val="Prrafodelista"/>
+              <w:spacing w:line="360" w:lineRule="auto"/>
+              <w:ind w:left="0"/>
+              <w:jc w:val="center"/>
+              <w:rPr>
+                <w:rFonts w:ascii="Times New Roman" w:eastAsia="Arial" w:hAnsi="Times New Roman" w:cs="Times New Roman"/>
+                <w:color w:val="000000"/>
+                <w:sz w:val="24"/>
+                <w:szCs w:val="24"/>
+              </w:rPr>
+            </w:pPr>
+            <w:r>
+              <w:rPr>
+                <w:rFonts w:ascii="Times New Roman" w:eastAsia="Arial" w:hAnsi="Times New Roman" w:cs="Times New Roman"/>
+                <w:color w:val="000000"/>
+                <w:sz w:val="24"/>
+                <w:szCs w:val="24"/>
+              </w:rPr>
+              <w:t xml:space="preserve">Mensaje de confirmación e </w:t>
+            </w:r>
+            <w:proofErr w:type="spellStart"/>
+            <w:r>
+              <w:rPr>
+                <w:rFonts w:ascii="Times New Roman" w:eastAsia="Arial" w:hAnsi="Times New Roman" w:cs="Times New Roman"/>
+                <w:color w:val="000000"/>
+                <w:sz w:val="24"/>
+                <w:szCs w:val="24"/>
+              </w:rPr>
+              <w:t>id_prestamo</w:t>
+            </w:r>
+            <w:proofErr w:type="spellEnd"/>
+          </w:p>
+        </w:tc>
+      </w:tr>
+      <w:tr>
+        <w:tc>
+          <w:tcPr>
+            <w:tcW w:w="4148" w:type="dxa"/>
+            <w:shd w:val="clear" w:color="auto" w:fill="DBE5F1" w:themeFill="accent1" w:themeFillTint="33"/>
+          </w:tcPr>
+          <w:p>
+            <w:pPr>
+              <w:pStyle w:val="Prrafodelista"/>
+              <w:spacing w:line="360" w:lineRule="auto"/>
+              <w:ind w:left="0"/>
+              <w:jc w:val="center"/>
+              <w:rPr>
+                <w:rFonts w:ascii="Times New Roman" w:eastAsia="Arial" w:hAnsi="Times New Roman" w:cs="Times New Roman"/>
+                <w:b/>
+                <w:bCs/>
+                <w:color w:val="000000"/>
+                <w:sz w:val="24"/>
+                <w:szCs w:val="24"/>
+              </w:rPr>
+            </w:pPr>
+            <w:r>
+              <w:rPr>
+                <w:rFonts w:ascii="Times New Roman" w:eastAsia="Arial" w:hAnsi="Times New Roman" w:cs="Times New Roman"/>
+                <w:b/>
+                <w:bCs/>
+                <w:color w:val="000000"/>
+                <w:sz w:val="24"/>
+                <w:szCs w:val="24"/>
+              </w:rPr>
+              <w:t>TABLAS</w:t>
+            </w:r>
+          </w:p>
+        </w:tc>
+        <w:tc>
+          <w:tcPr>
+            <w:tcW w:w="4148" w:type="dxa"/>
+            <w:shd w:val="clear" w:color="auto" w:fill="F2DBDB" w:themeFill="accent2" w:themeFillTint="33"/>
+          </w:tcPr>
+          <w:p>
+            <w:pPr>
+              <w:pStyle w:val="Prrafodelista"/>
+              <w:spacing w:line="360" w:lineRule="auto"/>
+              <w:ind w:left="0"/>
+              <w:jc w:val="center"/>
+              <w:rPr>
+                <w:rFonts w:ascii="Times New Roman" w:eastAsia="Arial" w:hAnsi="Times New Roman" w:cs="Times New Roman"/>
+                <w:color w:val="000000"/>
+                <w:sz w:val="24"/>
+                <w:szCs w:val="24"/>
+              </w:rPr>
+            </w:pPr>
+            <w:r>
+              <w:rPr>
+                <w:rFonts w:ascii="Times New Roman" w:eastAsia="Arial" w:hAnsi="Times New Roman" w:cs="Times New Roman"/>
+                <w:color w:val="000000"/>
+                <w:sz w:val="24"/>
+                <w:szCs w:val="24"/>
+              </w:rPr>
+              <w:t>Préstamos y libros</w:t>
+            </w:r>
+          </w:p>
+        </w:tc>
+      </w:tr>
+      <w:tr>
+        <w:tc>
+          <w:tcPr>
+            <w:tcW w:w="4148" w:type="dxa"/>
+            <w:shd w:val="clear" w:color="auto" w:fill="DBE5F1" w:themeFill="accent1" w:themeFillTint="33"/>
+          </w:tcPr>
+          <w:p>
+            <w:pPr>
+              <w:pStyle w:val="Prrafodelista"/>
+              <w:spacing w:line="360" w:lineRule="auto"/>
+              <w:ind w:left="0"/>
+              <w:jc w:val="center"/>
+              <w:rPr>
+                <w:rFonts w:ascii="Times New Roman" w:eastAsia="Arial" w:hAnsi="Times New Roman" w:cs="Times New Roman"/>
+                <w:b/>
+                <w:bCs/>
+                <w:color w:val="000000"/>
+                <w:sz w:val="24"/>
+                <w:szCs w:val="24"/>
+              </w:rPr>
+            </w:pPr>
+            <w:r>
+              <w:rPr>
+                <w:rFonts w:ascii="Times New Roman" w:eastAsia="Arial" w:hAnsi="Times New Roman" w:cs="Times New Roman"/>
+                <w:b/>
+                <w:bCs/>
+                <w:color w:val="000000"/>
+                <w:sz w:val="24"/>
+                <w:szCs w:val="24"/>
+              </w:rPr>
+              <w:t>INTERFACES</w:t>
+            </w:r>
+          </w:p>
+        </w:tc>
+        <w:tc>
+          <w:tcPr>
+            <w:tcW w:w="4148" w:type="dxa"/>
+            <w:shd w:val="clear" w:color="auto" w:fill="F2DBDB" w:themeFill="accent2" w:themeFillTint="33"/>
+          </w:tcPr>
+          <w:p>
+            <w:pPr>
+              <w:pStyle w:val="Prrafodelista"/>
+              <w:spacing w:line="360" w:lineRule="auto"/>
+              <w:ind w:left="0"/>
+              <w:jc w:val="center"/>
+              <w:rPr>
+                <w:rFonts w:ascii="Times New Roman" w:eastAsia="Arial" w:hAnsi="Times New Roman" w:cs="Times New Roman"/>
+                <w:color w:val="000000"/>
+                <w:sz w:val="24"/>
+                <w:szCs w:val="24"/>
+              </w:rPr>
+            </w:pPr>
+            <w:r>
+              <w:rPr>
+                <w:rFonts w:ascii="Times New Roman" w:eastAsia="Arial" w:hAnsi="Times New Roman" w:cs="Times New Roman"/>
+                <w:color w:val="000000"/>
+                <w:sz w:val="24"/>
+                <w:szCs w:val="24"/>
+              </w:rPr>
+              <w:t>Ficha-libro.html</w:t>
+            </w:r>
+          </w:p>
+        </w:tc>
+      </w:tr>
+    </w:tbl>
+    <w:p>
+      <w:pPr>
+        <w:pStyle w:val="Prrafodelista"/>
+        <w:spacing w:line="360" w:lineRule="auto"/>
+        <w:jc w:val="both"/>
+        <w:rPr>
+          <w:rFonts w:ascii="Times New Roman" w:eastAsia="Arial" w:hAnsi="Times New Roman" w:cs="Times New Roman"/>
+          <w:color w:val="000000"/>
+          <w:sz w:val="24"/>
+          <w:szCs w:val="24"/>
+        </w:rPr>
+      </w:pPr>
+    </w:p>
+    <w:p>
+      <w:pPr>
+        <w:pStyle w:val="Prrafodelista"/>
+        <w:numPr>
+          <w:ilvl w:val="0"/>
+          <w:numId w:val="6"/>
+        </w:numPr>
+        <w:spacing w:line="360" w:lineRule="auto"/>
+        <w:jc w:val="both"/>
+        <w:rPr>
+          <w:rFonts w:ascii="Times New Roman" w:eastAsia="Arial" w:hAnsi="Times New Roman" w:cs="Times New Roman"/>
+          <w:color w:val="000000"/>
+          <w:sz w:val="24"/>
+          <w:szCs w:val="24"/>
+        </w:rPr>
+      </w:pPr>
+    </w:p>
+    <w:p>
+      <w:pPr>
+        <w:spacing w:line="360" w:lineRule="auto"/>
+        <w:jc w:val="both"/>
+        <w:rPr>
+          <w:rFonts w:ascii="Times New Roman" w:eastAsia="Arial" w:hAnsi="Times New Roman" w:cs="Times New Roman"/>
+          <w:b/>
+          <w:bCs/>
+          <w:color w:val="000000"/>
+          <w:sz w:val="28"/>
+          <w:szCs w:val="28"/>
+        </w:rPr>
+      </w:pPr>
+    </w:p>
+    <w:p>
+      <w:pPr>
+        <w:spacing w:line="360" w:lineRule="auto"/>
+        <w:jc w:val="both"/>
+        <w:rPr>
+          <w:rFonts w:ascii="Arial" w:eastAsia="Arial" w:hAnsi="Arial" w:cs="Arial"/>
+          <w:color w:val="000000"/>
+        </w:rPr>
+      </w:pPr>
+    </w:p>
+    <w:p>
+      <w:pPr>
+        <w:spacing w:line="360" w:lineRule="auto"/>
+        <w:jc w:val="both"/>
+        <w:rPr>
+          <w:rFonts w:ascii="Arial" w:eastAsia="Arial" w:hAnsi="Arial" w:cs="Arial"/>
+          <w:color w:val="000000"/>
+        </w:rPr>
+      </w:pPr>
+    </w:p>
+    <w:p>
+      <w:pPr>
+        <w:spacing w:line="360" w:lineRule="auto"/>
+        <w:jc w:val="both"/>
+        <w:rPr>
+          <w:rFonts w:ascii="Arial" w:eastAsia="Arial" w:hAnsi="Arial" w:cs="Arial"/>
+          <w:color w:val="000000"/>
+        </w:rPr>
+      </w:pPr>
+    </w:p>
+    <w:p>
+      <w:pPr>
+        <w:spacing w:line="360" w:lineRule="auto"/>
+        <w:jc w:val="both"/>
+        <w:rPr>
+          <w:rFonts w:ascii="Arial" w:eastAsia="Arial" w:hAnsi="Arial" w:cs="Arial"/>
+          <w:color w:val="000000"/>
+        </w:rPr>
+      </w:pPr>
+    </w:p>
+    <w:p>
+      <w:pPr>
+        <w:spacing w:line="360" w:lineRule="auto"/>
+        <w:jc w:val="both"/>
+        <w:rPr>
+          <w:rFonts w:ascii="Arial" w:eastAsia="Arial" w:hAnsi="Arial" w:cs="Arial"/>
+          <w:color w:val="000000"/>
+        </w:rPr>
+      </w:pPr>
+    </w:p>
+    <w:p>
+      <w:pPr>
+        <w:spacing w:line="360" w:lineRule="auto"/>
+        <w:jc w:val="both"/>
+        <w:rPr>
+          <w:rFonts w:ascii="Arial" w:eastAsia="Arial" w:hAnsi="Arial" w:cs="Arial"/>
+          <w:color w:val="000000"/>
+        </w:rPr>
+      </w:pPr>
+    </w:p>
+    <w:p>
+      <w:pPr>
+        <w:spacing w:line="360" w:lineRule="auto"/>
+        <w:jc w:val="both"/>
+        <w:rPr>
+          <w:rFonts w:ascii="Arial" w:eastAsia="Arial" w:hAnsi="Arial" w:cs="Arial"/>
+          <w:color w:val="000000"/>
+        </w:rPr>
+      </w:pPr>
+    </w:p>
+    <w:p>
+      <w:pPr>
+        <w:spacing w:line="360" w:lineRule="auto"/>
+        <w:jc w:val="both"/>
+        <w:rPr>
+          <w:rFonts w:ascii="Arial" w:eastAsia="Arial" w:hAnsi="Arial" w:cs="Arial"/>
+          <w:color w:val="000000"/>
+        </w:rPr>
+      </w:pPr>
+    </w:p>
+    <w:p>
+      <w:pPr>
+        <w:spacing w:line="360" w:lineRule="auto"/>
+        <w:jc w:val="both"/>
+        <w:rPr>
+          <w:rFonts w:ascii="Arial" w:eastAsia="Arial" w:hAnsi="Arial" w:cs="Arial"/>
+          <w:color w:val="000000"/>
+        </w:rPr>
+      </w:pPr>
+    </w:p>
+    <w:p>
+      <w:pPr>
+        <w:spacing w:line="360" w:lineRule="auto"/>
+        <w:jc w:val="both"/>
+        <w:rPr>
+          <w:rFonts w:ascii="Arial" w:eastAsia="Arial" w:hAnsi="Arial" w:cs="Arial"/>
+          <w:color w:val="000000"/>
+        </w:rPr>
+      </w:pPr>
+    </w:p>
+    <w:p>
+      <w:pPr>
+        <w:spacing w:line="360" w:lineRule="auto"/>
+        <w:jc w:val="both"/>
+        <w:rPr>
+          <w:rFonts w:ascii="Arial" w:eastAsia="Arial" w:hAnsi="Arial" w:cs="Arial"/>
+          <w:color w:val="000000"/>
+        </w:rPr>
+      </w:pPr>
+    </w:p>
+    <w:p>
+      <w:pPr>
+        <w:spacing w:line="360" w:lineRule="auto"/>
+        <w:jc w:val="both"/>
+        <w:rPr>
+          <w:rFonts w:ascii="Arial" w:eastAsia="Arial" w:hAnsi="Arial" w:cs="Arial"/>
+          <w:color w:val="000000"/>
+        </w:rPr>
+      </w:pPr>
+    </w:p>
+    <w:p>
+      <w:pPr>
+        <w:spacing w:line="360" w:lineRule="auto"/>
+        <w:jc w:val="both"/>
+        <w:rPr>
+          <w:rFonts w:ascii="Arial" w:eastAsia="Arial" w:hAnsi="Arial" w:cs="Arial"/>
+          <w:color w:val="000000"/>
+        </w:rPr>
+      </w:pPr>
     </w:p>
     <w:p>
       <w:pPr>
@@ -3522,7 +5024,7 @@
                     <pic:cNvPicPr/>
                   </pic:nvPicPr>
                   <pic:blipFill>
-                    <a:blip r:embed="rId11">
+                    <a:blip r:embed="rId13">
                       <a:extLst>
                         <a:ext uri="{28A0092B-C50C-407E-A947-70E740481C1C}">
                           <a14:useLocalDpi xmlns:a14="http://schemas.microsoft.com/office/drawing/2010/main" val="0"/>
@@ -3571,7 +5073,7 @@
                     <pic:cNvPicPr/>
                   </pic:nvPicPr>
                   <pic:blipFill>
-                    <a:blip r:embed="rId12">
+                    <a:blip r:embed="rId14">
                       <a:extLst>
                         <a:ext uri="{28A0092B-C50C-407E-A947-70E740481C1C}">
                           <a14:useLocalDpi xmlns:a14="http://schemas.microsoft.com/office/drawing/2010/main" val="0"/>
@@ -3624,7 +5126,7 @@
                     <pic:cNvPicPr/>
                   </pic:nvPicPr>
                   <pic:blipFill>
-                    <a:blip r:embed="rId13">
+                    <a:blip r:embed="rId15">
                       <a:extLst>
                         <a:ext uri="{28A0092B-C50C-407E-A947-70E740481C1C}">
                           <a14:useLocalDpi xmlns:a14="http://schemas.microsoft.com/office/drawing/2010/main" val="0"/>
@@ -3671,7 +5173,7 @@
                     <pic:cNvPicPr/>
                   </pic:nvPicPr>
                   <pic:blipFill>
-                    <a:blip r:embed="rId14">
+                    <a:blip r:embed="rId16">
                       <a:extLst>
                         <a:ext uri="{28A0092B-C50C-407E-A947-70E740481C1C}">
                           <a14:useLocalDpi xmlns:a14="http://schemas.microsoft.com/office/drawing/2010/main" val="0"/>
@@ -3717,7 +5219,7 @@
                     <pic:cNvPicPr/>
                   </pic:nvPicPr>
                   <pic:blipFill>
-                    <a:blip r:embed="rId15">
+                    <a:blip r:embed="rId17">
                       <a:extLst>
                         <a:ext uri="{28A0092B-C50C-407E-A947-70E740481C1C}">
                           <a14:useLocalDpi xmlns:a14="http://schemas.microsoft.com/office/drawing/2010/main" val="0"/>
@@ -3764,7 +5266,7 @@
                     <pic:cNvPicPr/>
                   </pic:nvPicPr>
                   <pic:blipFill>
-                    <a:blip r:embed="rId16">
+                    <a:blip r:embed="rId18">
                       <a:extLst>
                         <a:ext uri="{28A0092B-C50C-407E-A947-70E740481C1C}">
                           <a14:useLocalDpi xmlns:a14="http://schemas.microsoft.com/office/drawing/2010/main" val="0"/>
@@ -3811,7 +5313,7 @@
                     <pic:cNvPicPr/>
                   </pic:nvPicPr>
                   <pic:blipFill>
-                    <a:blip r:embed="rId17">
+                    <a:blip r:embed="rId19">
                       <a:extLst>
                         <a:ext uri="{28A0092B-C50C-407E-A947-70E740481C1C}">
                           <a14:useLocalDpi xmlns:a14="http://schemas.microsoft.com/office/drawing/2010/main" val="0"/>
@@ -6872,7 +8374,7 @@
         </w:rPr>
         <w:t xml:space="preserve">. </w:t>
       </w:r>
-      <w:hyperlink r:id="rId18" w:history="1">
+      <w:hyperlink r:id="rId20" w:history="1">
         <w:r>
           <w:rPr>
             <w:rStyle w:val="Hipervnculo"/>
@@ -6886,13 +8388,14 @@
         <w:spacing w:line="360" w:lineRule="auto"/>
         <w:rPr>
           <w:color w:val="000000"/>
-        </w:rPr>
-      </w:pPr>
-      <w:r>
-        <w:rPr>
-          <w:color w:val="000000"/>
           <w:lang w:val="en-US"/>
         </w:rPr>
+      </w:pPr>
+      <w:r>
+        <w:rPr>
+          <w:color w:val="000000"/>
+          <w:lang w:val="en-US"/>
+        </w:rPr>
         <w:t>Hart, M. (</w:t>
       </w:r>
       <w:proofErr w:type="spellStart"/>
@@ -6911,10 +8414,11 @@
         </w:rPr>
         <w:t xml:space="preserve">). Project Gutenberg. </w:t>
       </w:r>
-      <w:hyperlink r:id="rId19" w:history="1">
+      <w:hyperlink r:id="rId21" w:history="1">
         <w:r>
           <w:rPr>
             <w:rStyle w:val="Hipervnculo"/>
+            <w:lang w:val="en-US"/>
           </w:rPr>
           <w:t>https://www.gutenberg.org</w:t>
         </w:r>
@@ -6925,13 +8429,14 @@
         <w:spacing w:line="360" w:lineRule="auto"/>
         <w:rPr>
           <w:color w:val="000000"/>
-        </w:rPr>
-      </w:pPr>
-      <w:r>
-        <w:rPr>
-          <w:color w:val="000000"/>
           <w:lang w:val="en-US"/>
         </w:rPr>
+      </w:pPr>
+      <w:r>
+        <w:rPr>
+          <w:color w:val="000000"/>
+          <w:lang w:val="en-US"/>
+        </w:rPr>
         <w:t>Okta. (</w:t>
       </w:r>
       <w:proofErr w:type="spellStart"/>
@@ -6950,10 +8455,11 @@
         </w:rPr>
         <w:t xml:space="preserve">). Introduction to JSON Web Tokens. </w:t>
       </w:r>
-      <w:hyperlink r:id="rId20" w:history="1">
+      <w:hyperlink r:id="rId22" w:history="1">
         <w:r>
           <w:rPr>
             <w:rStyle w:val="Hipervnculo"/>
+            <w:lang w:val="en-US"/>
           </w:rPr>
           <w:t>https://jwt.io/introduction</w:t>
         </w:r>
@@ -6964,6 +8470,7 @@
         <w:spacing w:line="360" w:lineRule="auto"/>
         <w:rPr>
           <w:color w:val="000000"/>
+          <w:lang w:val="en-US"/>
         </w:rPr>
       </w:pPr>
       <w:proofErr w:type="spellStart"/>
@@ -6998,10 +8505,11 @@
         </w:rPr>
         <w:t xml:space="preserve">). Node.js Documentation. </w:t>
       </w:r>
-      <w:hyperlink r:id="rId21" w:history="1">
+      <w:hyperlink r:id="rId23" w:history="1">
         <w:r>
           <w:rPr>
             <w:rStyle w:val="Hipervnculo"/>
+            <w:lang w:val="en-US"/>
           </w:rPr>
           <w:t>https://nodejs.org/en/docs</w:t>
         </w:r>
@@ -7012,6 +8520,7 @@
         <w:spacing w:line="360" w:lineRule="auto"/>
         <w:rPr>
           <w:color w:val="000000"/>
+          <w:lang w:val="en-US"/>
         </w:rPr>
       </w:pPr>
       <w:proofErr w:type="spellStart"/>
@@ -7046,10 +8555,11 @@
         </w:rPr>
         <w:t xml:space="preserve">). Express.js Documentation. </w:t>
       </w:r>
-      <w:hyperlink r:id="rId22" w:history="1">
+      <w:hyperlink r:id="rId24" w:history="1">
         <w:r>
           <w:rPr>
             <w:rStyle w:val="Hipervnculo"/>
+            <w:lang w:val="en-US"/>
           </w:rPr>
           <w:t>https://expressjs.com</w:t>
         </w:r>
@@ -7060,12 +8570,14 @@
         <w:spacing w:line="360" w:lineRule="auto"/>
         <w:rPr>
           <w:color w:val="000000"/>
+          <w:lang w:val="en-US"/>
         </w:rPr>
       </w:pPr>
       <w:proofErr w:type="spellStart"/>
       <w:r>
         <w:rPr>
           <w:color w:val="000000"/>
+          <w:lang w:val="en-US"/>
         </w:rPr>
         <w:t>npm</w:t>
       </w:r>
@@ -7073,13 +8585,31 @@
       <w:r>
         <w:rPr>
           <w:color w:val="000000"/>
-        </w:rPr>
-        <w:t xml:space="preserve">. (s.f.). </w:t>
+          <w:lang w:val="en-US"/>
+        </w:rPr>
+        <w:t>. (</w:t>
       </w:r>
       <w:proofErr w:type="spellStart"/>
       <w:r>
         <w:rPr>
           <w:color w:val="000000"/>
+          <w:lang w:val="en-US"/>
+        </w:rPr>
+        <w:t>s.f.</w:t>
+      </w:r>
+      <w:proofErr w:type="spellEnd"/>
+      <w:r>
+        <w:rPr>
+          <w:color w:val="000000"/>
+          <w:lang w:val="en-US"/>
+        </w:rPr>
+        <w:t xml:space="preserve">). </w:t>
+      </w:r>
+      <w:proofErr w:type="spellStart"/>
+      <w:r>
+        <w:rPr>
+          <w:color w:val="000000"/>
+          <w:lang w:val="en-US"/>
         </w:rPr>
         <w:t>bcrypt</w:t>
       </w:r>
@@ -7087,13 +8617,15 @@
       <w:r>
         <w:rPr>
           <w:color w:val="000000"/>
+          <w:lang w:val="en-US"/>
         </w:rPr>
         <w:t xml:space="preserve">. </w:t>
       </w:r>
-      <w:hyperlink r:id="rId23" w:history="1">
+      <w:hyperlink r:id="rId25" w:history="1">
         <w:r>
           <w:rPr>
             <w:rStyle w:val="Hipervnculo"/>
+            <w:lang w:val="en-US"/>
           </w:rPr>
           <w:t>https://www.npmjs.com/package/bcrypt</w:t>
         </w:r>
@@ -7104,12 +8636,14 @@
         <w:spacing w:line="360" w:lineRule="auto"/>
         <w:rPr>
           <w:color w:val="000000"/>
+          <w:lang w:val="en-US"/>
         </w:rPr>
       </w:pPr>
       <w:proofErr w:type="spellStart"/>
       <w:r>
         <w:rPr>
           <w:color w:val="000000"/>
+          <w:lang w:val="en-US"/>
         </w:rPr>
         <w:t>npm</w:t>
       </w:r>
@@ -7117,13 +8651,31 @@
       <w:r>
         <w:rPr>
           <w:color w:val="000000"/>
-        </w:rPr>
-        <w:t xml:space="preserve">. (s.f.). mysql2. </w:t>
-      </w:r>
-      <w:hyperlink r:id="rId24" w:history="1">
+          <w:lang w:val="en-US"/>
+        </w:rPr>
+        <w:t>. (</w:t>
+      </w:r>
+      <w:proofErr w:type="spellStart"/>
+      <w:r>
+        <w:rPr>
+          <w:color w:val="000000"/>
+          <w:lang w:val="en-US"/>
+        </w:rPr>
+        <w:t>s.f.</w:t>
+      </w:r>
+      <w:proofErr w:type="spellEnd"/>
+      <w:r>
+        <w:rPr>
+          <w:color w:val="000000"/>
+          <w:lang w:val="en-US"/>
+        </w:rPr>
+        <w:t xml:space="preserve">). mysql2. </w:t>
+      </w:r>
+      <w:hyperlink r:id="rId26" w:history="1">
         <w:r>
           <w:rPr>
             <w:rStyle w:val="Hipervnculo"/>
+            <w:lang w:val="en-US"/>
           </w:rPr>
           <w:t>https://www.npmjs.com/package/mysql2</w:t>
         </w:r>
@@ -7134,12 +8686,14 @@
         <w:spacing w:line="360" w:lineRule="auto"/>
         <w:rPr>
           <w:color w:val="000000"/>
+          <w:lang w:val="en-US"/>
         </w:rPr>
       </w:pPr>
       <w:proofErr w:type="spellStart"/>
       <w:r>
         <w:rPr>
           <w:color w:val="000000"/>
+          <w:lang w:val="en-US"/>
         </w:rPr>
         <w:t>npm</w:t>
       </w:r>
@@ -7147,13 +8701,31 @@
       <w:r>
         <w:rPr>
           <w:color w:val="000000"/>
-        </w:rPr>
-        <w:t xml:space="preserve">. (s.f.). </w:t>
+          <w:lang w:val="en-US"/>
+        </w:rPr>
+        <w:t>. (</w:t>
       </w:r>
       <w:proofErr w:type="spellStart"/>
       <w:r>
         <w:rPr>
           <w:color w:val="000000"/>
+          <w:lang w:val="en-US"/>
+        </w:rPr>
+        <w:t>s.f.</w:t>
+      </w:r>
+      <w:proofErr w:type="spellEnd"/>
+      <w:r>
+        <w:rPr>
+          <w:color w:val="000000"/>
+          <w:lang w:val="en-US"/>
+        </w:rPr>
+        <w:t xml:space="preserve">). </w:t>
+      </w:r>
+      <w:proofErr w:type="spellStart"/>
+      <w:r>
+        <w:rPr>
+          <w:color w:val="000000"/>
+          <w:lang w:val="en-US"/>
         </w:rPr>
         <w:t>dotenv</w:t>
       </w:r>
@@ -7161,13 +8733,15 @@
       <w:r>
         <w:rPr>
           <w:color w:val="000000"/>
+          <w:lang w:val="en-US"/>
         </w:rPr>
         <w:t xml:space="preserve">. </w:t>
       </w:r>
-      <w:hyperlink r:id="rId25" w:history="1">
+      <w:hyperlink r:id="rId27" w:history="1">
         <w:r>
           <w:rPr>
             <w:rStyle w:val="Hipervnculo"/>
+            <w:lang w:val="en-US"/>
           </w:rPr>
           <w:t>https://www.npmjs.com/package/dotenv</w:t>
         </w:r>
@@ -7203,7 +8777,7 @@
         </w:rPr>
         <w:t xml:space="preserve">). MySQL Documentation. </w:t>
       </w:r>
-      <w:hyperlink r:id="rId26" w:history="1">
+      <w:hyperlink r:id="rId28" w:history="1">
         <w:r>
           <w:rPr>
             <w:rStyle w:val="Hipervnculo"/>
@@ -7261,7 +8835,7 @@
         </w:rPr>
         <w:t xml:space="preserve">. </w:t>
       </w:r>
-      <w:hyperlink r:id="rId27" w:history="1">
+      <w:hyperlink r:id="rId29" w:history="1">
         <w:r>
           <w:rPr>
             <w:rStyle w:val="Hipervnculo"/>
@@ -7297,7 +8871,7 @@
         </w:rPr>
         <w:t xml:space="preserve">. </w:t>
       </w:r>
-      <w:hyperlink r:id="rId28" w:history="1">
+      <w:hyperlink r:id="rId30" w:history="1">
         <w:r>
           <w:rPr>
             <w:rStyle w:val="Hipervnculo"/>
@@ -7316,27 +8890,24 @@
       <w:r>
         <w:rPr>
           <w:color w:val="000000"/>
-          <w:lang w:val="en-US"/>
-        </w:rPr>
-        <w:t>GitHub. (</w:t>
+        </w:rPr>
+        <w:t xml:space="preserve">GitHub. (s.f.). GitHub </w:t>
       </w:r>
       <w:proofErr w:type="spellStart"/>
       <w:r>
         <w:rPr>
           <w:color w:val="000000"/>
-          <w:lang w:val="en-US"/>
-        </w:rPr>
-        <w:t>s.f.</w:t>
+        </w:rPr>
+        <w:t>Documentation</w:t>
       </w:r>
       <w:proofErr w:type="spellEnd"/>
       <w:r>
         <w:rPr>
           <w:color w:val="000000"/>
-          <w:lang w:val="en-US"/>
-        </w:rPr>
-        <w:t xml:space="preserve">). GitHub Documentation. </w:t>
-      </w:r>
-      <w:hyperlink r:id="rId29" w:history="1">
+        </w:rPr>
+        <w:t xml:space="preserve">. </w:t>
+      </w:r>
+      <w:hyperlink r:id="rId31" w:history="1">
         <w:r>
           <w:rPr>
             <w:rStyle w:val="Hipervnculo"/>
@@ -7386,7 +8957,7 @@
         </w:rPr>
         <w:t xml:space="preserve">. </w:t>
       </w:r>
-      <w:hyperlink r:id="rId30" w:history="1">
+      <w:hyperlink r:id="rId32" w:history="1">
         <w:r>
           <w:rPr>
             <w:rStyle w:val="Hipervnculo"/>
@@ -7396,8 +8967,8 @@
       </w:hyperlink>
     </w:p>
     <w:sectPr>
-      <w:headerReference w:type="default" r:id="rId31"/>
-      <w:footerReference w:type="default" r:id="rId32"/>
+      <w:headerReference w:type="default" r:id="rId33"/>
+      <w:footerReference w:type="default" r:id="rId34"/>
       <w:pgSz w:w="11906" w:h="16838"/>
       <w:pgMar w:top="1440" w:right="1440" w:bottom="1440" w:left="1440" w:header="426" w:footer="720" w:gutter="0"/>
       <w:pgNumType w:start="1"/>
@@ -7784,6 +9355,95 @@
 <file path=word/numbering.xml><?xml version="1.0" encoding="utf-8"?>
 <w:numbering xmlns:wpc="http://schemas.microsoft.com/office/word/2010/wordprocessingCanvas" xmlns:cx="http://schemas.microsoft.com/office/drawing/2014/chartex" xmlns:cx1="http://schemas.microsoft.com/office/drawing/2015/9/8/chartex" xmlns:cx2="http://schemas.microsoft.com/office/drawing/2015/10/21/chartex" xmlns:cx3="http://schemas.microsoft.com/office/drawing/2016/5/9/chartex" xmlns:cx4="http://schemas.microsoft.com/office/drawing/2016/5/10/chartex" xmlns:cx5="http://schemas.microsoft.com/office/drawing/2016/5/11/chartex" xmlns:cx6="http://schemas.microsoft.com/office/drawing/2016/5/12/chartex" xmlns:cx7="http://schemas.microsoft.com/office/drawing/2016/5/13/chartex" xmlns:cx8="http://schemas.microsoft.com/office/drawing/2016/5/14/chartex" xmlns:mc="http://schemas.openxmlformats.org/markup-compatibility/2006" xmlns:aink="http://schemas.microsoft.com/office/drawing/2016/ink" xmlns:am3d="http://schemas.microsoft.com/office/drawing/2017/model3d" xmlns:o="urn:schemas-microsoft-com:office:office" xmlns:oel="http://schemas.microsoft.com/office/2019/extlst" xmlns:r="http://schemas.openxmlformats.org/officeDocument/2006/relationships" xmlns:m="http://schemas.openxmlformats.org/officeDocument/2006/math" xmlns:v="urn:schemas-microsoft-com:vml" xmlns:wp14="http://schemas.microsoft.com/office/word/2010/wordprocessingDrawing" xmlns:wp="http://schemas.openxmlformats.org/drawingml/2006/wordprocessingDrawing" xmlns:w10="urn:schemas-microsoft-com:office:word" xmlns:w="http://schemas.openxmlformats.org/wordprocessingml/2006/main" xmlns:w14="http://schemas.microsoft.com/office/word/2010/wordml" xmlns:w15="http://schemas.microsoft.com/office/word/2012/wordml" xmlns:w16cex="http://schemas.microsoft.com/office/word/2018/wordml/cex" xmlns:w16cid="http://schemas.microsoft.com/office/word/2016/wordml/cid" xmlns:w16="http://schemas.microsoft.com/office/word/2018/wordml" xmlns:w16du="http://schemas.microsoft.com/office/word/2023/wordml/word16du" xmlns:w16sdtdh="http://schemas.microsoft.com/office/word/2020/wordml/sdtdatahash" xmlns:w16sdtfl="http://schemas.microsoft.com/office/word/2024/wordml/sdtformatlock" xmlns:w16se="http://schemas.microsoft.com/office/word/2015/wordml/symex" xmlns:wpg="http://schemas.microsoft.com/office/word/2010/wordprocessingGroup" xmlns:wpi="http://schemas.microsoft.com/office/word/2010/wordprocessingInk" xmlns:wne="http://schemas.microsoft.com/office/word/2006/wordml" xmlns:wps="http://schemas.microsoft.com/office/word/2010/wordprocessingShape" mc:Ignorable="w14 w15 w16se w16cid w16 w16cex w16sdtdh w16sdtfl w16du wp14">
   <w:abstractNum w:abstractNumId="0" w15:restartNumberingAfterBreak="0">
+    <w:nsid w:val="17526529"/>
+    <w:multiLevelType w:val="hybridMultilevel"/>
+    <w:tmpl w:val="F8B6DF98"/>
+    <w:lvl w:ilvl="0" w:tplc="0C0A000F">
+      <w:start w:val="1"/>
+      <w:numFmt w:val="decimal"/>
+      <w:lvlText w:val="%1."/>
+      <w:lvlJc w:val="left"/>
+      <w:pPr>
+        <w:ind w:left="720" w:hanging="360"/>
+      </w:pPr>
+      <w:rPr>
+        <w:rFonts w:hint="default"/>
+      </w:rPr>
+    </w:lvl>
+    <w:lvl w:ilvl="1" w:tplc="0C0A0019" w:tentative="1">
+      <w:start w:val="1"/>
+      <w:numFmt w:val="lowerLetter"/>
+      <w:lvlText w:val="%2."/>
+      <w:lvlJc w:val="left"/>
+      <w:pPr>
+        <w:ind w:left="1440" w:hanging="360"/>
+      </w:pPr>
+    </w:lvl>
+    <w:lvl w:ilvl="2" w:tplc="0C0A001B" w:tentative="1">
+      <w:start w:val="1"/>
+      <w:numFmt w:val="lowerRoman"/>
+      <w:lvlText w:val="%3."/>
+      <w:lvlJc w:val="right"/>
+      <w:pPr>
+        <w:ind w:left="2160" w:hanging="180"/>
+      </w:pPr>
+    </w:lvl>
+    <w:lvl w:ilvl="3" w:tplc="0C0A000F" w:tentative="1">
+      <w:start w:val="1"/>
+      <w:numFmt w:val="decimal"/>
+      <w:lvlText w:val="%4."/>
+      <w:lvlJc w:val="left"/>
+      <w:pPr>
+        <w:ind w:left="2880" w:hanging="360"/>
+      </w:pPr>
+    </w:lvl>
+    <w:lvl w:ilvl="4" w:tplc="0C0A0019" w:tentative="1">
+      <w:start w:val="1"/>
+      <w:numFmt w:val="lowerLetter"/>
+      <w:lvlText w:val="%5."/>
+      <w:lvlJc w:val="left"/>
+      <w:pPr>
+        <w:ind w:left="3600" w:hanging="360"/>
+      </w:pPr>
+    </w:lvl>
+    <w:lvl w:ilvl="5" w:tplc="0C0A001B" w:tentative="1">
+      <w:start w:val="1"/>
+      <w:numFmt w:val="lowerRoman"/>
+      <w:lvlText w:val="%6."/>
+      <w:lvlJc w:val="right"/>
+      <w:pPr>
+        <w:ind w:left="4320" w:hanging="180"/>
+      </w:pPr>
+    </w:lvl>
+    <w:lvl w:ilvl="6" w:tplc="0C0A000F" w:tentative="1">
+      <w:start w:val="1"/>
+      <w:numFmt w:val="decimal"/>
+      <w:lvlText w:val="%7."/>
+      <w:lvlJc w:val="left"/>
+      <w:pPr>
+        <w:ind w:left="5040" w:hanging="360"/>
+      </w:pPr>
+    </w:lvl>
+    <w:lvl w:ilvl="7" w:tplc="0C0A0019" w:tentative="1">
+      <w:start w:val="1"/>
+      <w:numFmt w:val="lowerLetter"/>
+      <w:lvlText w:val="%8."/>
+      <w:lvlJc w:val="left"/>
+      <w:pPr>
+        <w:ind w:left="5760" w:hanging="360"/>
+      </w:pPr>
+    </w:lvl>
+    <w:lvl w:ilvl="8" w:tplc="0C0A001B" w:tentative="1">
+      <w:start w:val="1"/>
+      <w:numFmt w:val="lowerRoman"/>
+      <w:lvlText w:val="%9."/>
+      <w:lvlJc w:val="right"/>
+      <w:pPr>
+        <w:ind w:left="6480" w:hanging="180"/>
+      </w:pPr>
+    </w:lvl>
+  </w:abstractNum>
+  <w:abstractNum w:abstractNumId="1" w15:restartNumberingAfterBreak="0">
     <w:nsid w:val="2C9E76F3"/>
     <w:multiLevelType w:val="multilevel"/>
     <w:tmpl w:val="750254D4"/>
@@ -7896,7 +9556,7 @@
       </w:rPr>
     </w:lvl>
   </w:abstractNum>
-  <w:abstractNum w:abstractNumId="1" w15:restartNumberingAfterBreak="0">
+  <w:abstractNum w:abstractNumId="2" w15:restartNumberingAfterBreak="0">
     <w:nsid w:val="362F7567"/>
     <w:multiLevelType w:val="hybridMultilevel"/>
     <w:tmpl w:val="640E0276"/>
@@ -7985,7 +9645,7 @@
       </w:pPr>
     </w:lvl>
   </w:abstractNum>
-  <w:abstractNum w:abstractNumId="2" w15:restartNumberingAfterBreak="0">
+  <w:abstractNum w:abstractNumId="3" w15:restartNumberingAfterBreak="0">
     <w:nsid w:val="5164325F"/>
     <w:multiLevelType w:val="hybridMultilevel"/>
     <w:tmpl w:val="39ECA23C"/>
@@ -8074,7 +9734,96 @@
       </w:pPr>
     </w:lvl>
   </w:abstractNum>
-  <w:abstractNum w:abstractNumId="3" w15:restartNumberingAfterBreak="0">
+  <w:abstractNum w:abstractNumId="4" w15:restartNumberingAfterBreak="0">
+    <w:nsid w:val="60D87F40"/>
+    <w:multiLevelType w:val="hybridMultilevel"/>
+    <w:tmpl w:val="0754872E"/>
+    <w:lvl w:ilvl="0" w:tplc="0C0A000F">
+      <w:start w:val="1"/>
+      <w:numFmt w:val="decimal"/>
+      <w:lvlText w:val="%1."/>
+      <w:lvlJc w:val="left"/>
+      <w:pPr>
+        <w:ind w:left="720" w:hanging="360"/>
+      </w:pPr>
+      <w:rPr>
+        <w:rFonts w:hint="default"/>
+      </w:rPr>
+    </w:lvl>
+    <w:lvl w:ilvl="1" w:tplc="0C0A0019" w:tentative="1">
+      <w:start w:val="1"/>
+      <w:numFmt w:val="lowerLetter"/>
+      <w:lvlText w:val="%2."/>
+      <w:lvlJc w:val="left"/>
+      <w:pPr>
+        <w:ind w:left="1440" w:hanging="360"/>
+      </w:pPr>
+    </w:lvl>
+    <w:lvl w:ilvl="2" w:tplc="0C0A001B" w:tentative="1">
+      <w:start w:val="1"/>
+      <w:numFmt w:val="lowerRoman"/>
+      <w:lvlText w:val="%3."/>
+      <w:lvlJc w:val="right"/>
+      <w:pPr>
+        <w:ind w:left="2160" w:hanging="180"/>
+      </w:pPr>
+    </w:lvl>
+    <w:lvl w:ilvl="3" w:tplc="0C0A000F" w:tentative="1">
+      <w:start w:val="1"/>
+      <w:numFmt w:val="decimal"/>
+      <w:lvlText w:val="%4."/>
+      <w:lvlJc w:val="left"/>
+      <w:pPr>
+        <w:ind w:left="2880" w:hanging="360"/>
+      </w:pPr>
+    </w:lvl>
+    <w:lvl w:ilvl="4" w:tplc="0C0A0019" w:tentative="1">
+      <w:start w:val="1"/>
+      <w:numFmt w:val="lowerLetter"/>
+      <w:lvlText w:val="%5."/>
+      <w:lvlJc w:val="left"/>
+      <w:pPr>
+        <w:ind w:left="3600" w:hanging="360"/>
+      </w:pPr>
+    </w:lvl>
+    <w:lvl w:ilvl="5" w:tplc="0C0A001B" w:tentative="1">
+      <w:start w:val="1"/>
+      <w:numFmt w:val="lowerRoman"/>
+      <w:lvlText w:val="%6."/>
+      <w:lvlJc w:val="right"/>
+      <w:pPr>
+        <w:ind w:left="4320" w:hanging="180"/>
+      </w:pPr>
+    </w:lvl>
+    <w:lvl w:ilvl="6" w:tplc="0C0A000F" w:tentative="1">
+      <w:start w:val="1"/>
+      <w:numFmt w:val="decimal"/>
+      <w:lvlText w:val="%7."/>
+      <w:lvlJc w:val="left"/>
+      <w:pPr>
+        <w:ind w:left="5040" w:hanging="360"/>
+      </w:pPr>
+    </w:lvl>
+    <w:lvl w:ilvl="7" w:tplc="0C0A0019" w:tentative="1">
+      <w:start w:val="1"/>
+      <w:numFmt w:val="lowerLetter"/>
+      <w:lvlText w:val="%8."/>
+      <w:lvlJc w:val="left"/>
+      <w:pPr>
+        <w:ind w:left="5760" w:hanging="360"/>
+      </w:pPr>
+    </w:lvl>
+    <w:lvl w:ilvl="8" w:tplc="0C0A001B" w:tentative="1">
+      <w:start w:val="1"/>
+      <w:numFmt w:val="lowerRoman"/>
+      <w:lvlText w:val="%9."/>
+      <w:lvlJc w:val="right"/>
+      <w:pPr>
+        <w:ind w:left="6480" w:hanging="180"/>
+      </w:pPr>
+    </w:lvl>
+  </w:abstractNum>
+  <w:abstractNum w:abstractNumId="5" w15:restartNumberingAfterBreak="0">
     <w:nsid w:val="68EE33F6"/>
     <w:multiLevelType w:val="hybridMultilevel"/>
     <w:tmpl w:val="9934F8C4"/>
@@ -8187,16 +9936,22 @@
     </w:lvl>
   </w:abstractNum>
   <w:num w:numId="1" w16cid:durableId="2032681759">
-    <w:abstractNumId w:val="0"/>
+    <w:abstractNumId w:val="1"/>
   </w:num>
   <w:num w:numId="2" w16cid:durableId="1780638573">
+    <w:abstractNumId w:val="5"/>
+  </w:num>
+  <w:num w:numId="3" w16cid:durableId="1197541616">
     <w:abstractNumId w:val="3"/>
   </w:num>
-  <w:num w:numId="3" w16cid:durableId="1197541616">
+  <w:num w:numId="4" w16cid:durableId="329481265">
     <w:abstractNumId w:val="2"/>
   </w:num>
-  <w:num w:numId="4" w16cid:durableId="329481265">
-    <w:abstractNumId w:val="1"/>
+  <w:num w:numId="5" w16cid:durableId="797189061">
+    <w:abstractNumId w:val="4"/>
+  </w:num>
+  <w:num w:numId="6" w16cid:durableId="179708329">
+    <w:abstractNumId w:val="0"/>
   </w:num>
 </w:numbering>
 </file>
@@ -8725,6 +10480,7 @@
   <w:style w:type="character" w:default="1" w:styleId="Fuentedeprrafopredeter">
     <w:name w:val="Default Paragraph Font"/>
     <w:uiPriority w:val="1"/>
+    <w:semiHidden/>
     <w:unhideWhenUsed/>
   </w:style>
   <w:style w:type="table" w:default="1" w:styleId="Tablanormal">
@@ -8888,6 +10644,25 @@
       <w:color w:val="605E5C"/>
       <w:shd w:val="clear" w:color="auto" w:fill="E1DFDD"/>
     </w:rPr>
+  </w:style>
+  <w:style w:type="table" w:styleId="Tablaconcuadrcula">
+    <w:name w:val="Table Grid"/>
+    <w:basedOn w:val="Tablanormal"/>
+    <w:uiPriority w:val="39"/>
+    <w:rsid w:val="009423AF"/>
+    <w:pPr>
+      <w:spacing w:after="0" w:line="240" w:lineRule="auto"/>
+    </w:pPr>
+    <w:tblPr>
+      <w:tblBorders>
+        <w:top w:val="single" w:sz="4" w:space="0" w:color="auto"/>
+        <w:left w:val="single" w:sz="4" w:space="0" w:color="auto"/>
+        <w:bottom w:val="single" w:sz="4" w:space="0" w:color="auto"/>
+        <w:right w:val="single" w:sz="4" w:space="0" w:color="auto"/>
+        <w:insideH w:val="single" w:sz="4" w:space="0" w:color="auto"/>
+        <w:insideV w:val="single" w:sz="4" w:space="0" w:color="auto"/>
+      </w:tblBorders>
+    </w:tblPr>
   </w:style>
 </w:styles>
 </file>
@@ -9210,4 +10985,16 @@
   </a:objectDefaults>
   <a:extraClrSchemeLst/>
 </a:theme>
+</file>
+
+<file path=customXml/item1.xml><?xml version="1.0" encoding="utf-8"?>
+<b:Sources xmlns:b="http://schemas.openxmlformats.org/officeDocument/2006/bibliography" xmlns="http://schemas.openxmlformats.org/officeDocument/2006/bibliography" SelectedStyle="\APASixthEditionOfficeOnline.xsl" StyleName="APA" Version="6"/>
+</file>
+
+<file path=customXml/itemProps1.xml><?xml version="1.0" encoding="utf-8"?>
+<ds:datastoreItem xmlns:ds="http://schemas.openxmlformats.org/officeDocument/2006/customXml" ds:itemID="{CE1E9F19-3165-48E8-9BB4-8DAD6664BB17}">
+  <ds:schemaRefs>
+    <ds:schemaRef ds:uri="http://schemas.openxmlformats.org/officeDocument/2006/bibliography"/>
+  </ds:schemaRefs>
+</ds:datastoreItem>
 </file>
</xml_diff>

<commit_message>
arreglos y añadidos mas libros a bbdd
</commit_message>
<xml_diff>
--- a/Lectarium_Memoria.docx
+++ b/Lectarium_Memoria.docx
@@ -3605,7 +3605,7 @@
           <w:lang w:val="es-ES"/>
         </w:rPr>
         <w:drawing>
-          <wp:inline distT="0" distB="0" distL="0" distR="0" wp14:anchorId="7A327CD8" wp14:editId="4352CC30">
+          <wp:inline distT="0" distB="0" distL="0" distR="0" wp14:anchorId="7A327CD8" wp14:editId="2E5630C5">
             <wp:extent cx="6109947" cy="448888"/>
             <wp:effectExtent l="0" t="0" r="0" b="8890"/>
             <wp:docPr id="2" name="Imagen 1"/>
@@ -8214,7 +8214,7 @@
         <w:spacing w:line="360" w:lineRule="auto"/>
         <w:jc w:val="both"/>
         <w:rPr>
-          <w:rFonts w:ascii="Arial" w:eastAsia="Arial" w:hAnsi="Arial" w:cs="Arial"/>
+          <w:rFonts w:ascii="Times New Roman" w:eastAsia="Arial" w:hAnsi="Times New Roman" w:cs="Times New Roman"/>
           <w:color w:val="000000"/>
           <w:sz w:val="32"/>
           <w:szCs w:val="32"/>
@@ -8222,12 +8222,256 @@
       </w:pPr>
       <w:r>
         <w:rPr>
-          <w:rFonts w:ascii="Arial" w:eastAsia="Arial" w:hAnsi="Arial" w:cs="Arial"/>
+          <w:rFonts w:ascii="Times New Roman" w:eastAsia="Arial" w:hAnsi="Times New Roman" w:cs="Times New Roman"/>
           <w:color w:val="000000"/>
           <w:sz w:val="32"/>
           <w:szCs w:val="32"/>
         </w:rPr>
         <w:t>METODOLOGÍA</w:t>
+      </w:r>
+    </w:p>
+    <w:p>
+      <w:pPr>
+        <w:spacing w:line="360" w:lineRule="auto"/>
+        <w:jc w:val="both"/>
+        <w:rPr>
+          <w:rFonts w:ascii="Times New Roman" w:eastAsia="Arial" w:hAnsi="Times New Roman" w:cs="Times New Roman"/>
+          <w:color w:val="000000"/>
+          <w:sz w:val="24"/>
+          <w:szCs w:val="24"/>
+        </w:rPr>
+      </w:pPr>
+      <w:r>
+        <w:rPr>
+          <w:rFonts w:ascii="Times New Roman" w:eastAsia="Arial" w:hAnsi="Times New Roman" w:cs="Times New Roman"/>
+          <w:color w:val="000000"/>
+          <w:sz w:val="24"/>
+          <w:szCs w:val="24"/>
+        </w:rPr>
+        <w:t xml:space="preserve">Para el desarrollo del proyecto </w:t>
+      </w:r>
+      <w:proofErr w:type="spellStart"/>
+      <w:r>
+        <w:rPr>
+          <w:rFonts w:ascii="Times New Roman" w:eastAsia="Arial" w:hAnsi="Times New Roman" w:cs="Times New Roman"/>
+          <w:color w:val="000000"/>
+          <w:sz w:val="24"/>
+          <w:szCs w:val="24"/>
+        </w:rPr>
+        <w:t>Lectarium</w:t>
+      </w:r>
+      <w:proofErr w:type="spellEnd"/>
+      <w:r>
+        <w:rPr>
+          <w:rFonts w:ascii="Times New Roman" w:eastAsia="Arial" w:hAnsi="Times New Roman" w:cs="Times New Roman"/>
+          <w:color w:val="000000"/>
+          <w:sz w:val="24"/>
+          <w:szCs w:val="24"/>
+        </w:rPr>
+        <w:t xml:space="preserve">, hemos seguido una metodología ágil con objetivos semanales y dividiendo el proyecto en distintas fases bien definidas. Primero ideamos la plataforma y las funcionalidades que queríamos que tuviera; después diseñamos la base de datos, empezando por crear sus diagramas entidad-relación; </w:t>
+      </w:r>
+      <w:r>
+        <w:rPr>
+          <w:rFonts w:ascii="Times New Roman" w:eastAsia="Arial" w:hAnsi="Times New Roman" w:cs="Times New Roman"/>
+          <w:color w:val="000000"/>
+          <w:sz w:val="24"/>
+          <w:szCs w:val="24"/>
+        </w:rPr>
+        <w:t xml:space="preserve">posteriormente, pasamos al desarrollo del </w:t>
+      </w:r>
+      <w:proofErr w:type="spellStart"/>
+      <w:r>
+        <w:rPr>
+          <w:rFonts w:ascii="Times New Roman" w:eastAsia="Arial" w:hAnsi="Times New Roman" w:cs="Times New Roman"/>
+          <w:color w:val="000000"/>
+          <w:sz w:val="24"/>
+          <w:szCs w:val="24"/>
+        </w:rPr>
+        <w:t>backend</w:t>
+      </w:r>
+      <w:proofErr w:type="spellEnd"/>
+      <w:r>
+        <w:rPr>
+          <w:rFonts w:ascii="Times New Roman" w:eastAsia="Arial" w:hAnsi="Times New Roman" w:cs="Times New Roman"/>
+          <w:color w:val="000000"/>
+          <w:sz w:val="24"/>
+          <w:szCs w:val="24"/>
+        </w:rPr>
+        <w:t xml:space="preserve">; y una vez terminado el </w:t>
+      </w:r>
+      <w:proofErr w:type="spellStart"/>
+      <w:r>
+        <w:rPr>
+          <w:rFonts w:ascii="Times New Roman" w:eastAsia="Arial" w:hAnsi="Times New Roman" w:cs="Times New Roman"/>
+          <w:color w:val="000000"/>
+          <w:sz w:val="24"/>
+          <w:szCs w:val="24"/>
+        </w:rPr>
+        <w:t>backend</w:t>
+      </w:r>
+      <w:proofErr w:type="spellEnd"/>
+      <w:r>
+        <w:rPr>
+          <w:rFonts w:ascii="Times New Roman" w:eastAsia="Arial" w:hAnsi="Times New Roman" w:cs="Times New Roman"/>
+          <w:color w:val="000000"/>
+          <w:sz w:val="24"/>
+          <w:szCs w:val="24"/>
+        </w:rPr>
+        <w:t xml:space="preserve">, comenzamos con el diseño visual con el uso de </w:t>
+      </w:r>
+      <w:proofErr w:type="spellStart"/>
+      <w:r>
+        <w:rPr>
+          <w:rFonts w:ascii="Times New Roman" w:eastAsia="Arial" w:hAnsi="Times New Roman" w:cs="Times New Roman"/>
+          <w:color w:val="000000"/>
+          <w:sz w:val="24"/>
+          <w:szCs w:val="24"/>
+        </w:rPr>
+        <w:t>Figma</w:t>
+      </w:r>
+      <w:proofErr w:type="spellEnd"/>
+      <w:r>
+        <w:rPr>
+          <w:rFonts w:ascii="Times New Roman" w:eastAsia="Arial" w:hAnsi="Times New Roman" w:cs="Times New Roman"/>
+          <w:color w:val="000000"/>
+          <w:sz w:val="24"/>
+          <w:szCs w:val="24"/>
+        </w:rPr>
+        <w:t xml:space="preserve">, para terminar con el desarrollo de la parte de </w:t>
+      </w:r>
+      <w:proofErr w:type="spellStart"/>
+      <w:r>
+        <w:rPr>
+          <w:rFonts w:ascii="Times New Roman" w:eastAsia="Arial" w:hAnsi="Times New Roman" w:cs="Times New Roman"/>
+          <w:color w:val="000000"/>
+          <w:sz w:val="24"/>
+          <w:szCs w:val="24"/>
+        </w:rPr>
+        <w:t>frontend</w:t>
+      </w:r>
+      <w:proofErr w:type="spellEnd"/>
+      <w:r>
+        <w:rPr>
+          <w:rFonts w:ascii="Times New Roman" w:eastAsia="Arial" w:hAnsi="Times New Roman" w:cs="Times New Roman"/>
+          <w:color w:val="000000"/>
+          <w:sz w:val="24"/>
+          <w:szCs w:val="24"/>
+        </w:rPr>
+        <w:t>. A su vez, cada una de las fases ha sido planificada por medio de tareas concretas, dividiendo el trabajo entre ambas desarrolladoras y revisándolo al finalizar antes de pasar a la siguiente fase.</w:t>
+      </w:r>
+    </w:p>
+    <w:p>
+      <w:pPr>
+        <w:spacing w:line="360" w:lineRule="auto"/>
+        <w:jc w:val="both"/>
+        <w:rPr>
+          <w:rFonts w:ascii="Times New Roman" w:eastAsia="Arial" w:hAnsi="Times New Roman" w:cs="Times New Roman"/>
+          <w:color w:val="000000"/>
+          <w:sz w:val="24"/>
+          <w:szCs w:val="24"/>
+        </w:rPr>
+      </w:pPr>
+      <w:r>
+        <w:rPr>
+          <w:rFonts w:ascii="Times New Roman" w:eastAsia="Arial" w:hAnsi="Times New Roman" w:cs="Times New Roman"/>
+          <w:color w:val="000000"/>
+          <w:sz w:val="24"/>
+          <w:szCs w:val="24"/>
+        </w:rPr>
+        <w:t xml:space="preserve">El control de versiones se ha gestionado a través de Git y GitHub, cada una de nosotras ha trabajado en su rama y hemos ido realizando </w:t>
+      </w:r>
+      <w:proofErr w:type="spellStart"/>
+      <w:r>
+        <w:rPr>
+          <w:rFonts w:ascii="Times New Roman" w:eastAsia="Arial" w:hAnsi="Times New Roman" w:cs="Times New Roman"/>
+          <w:i/>
+          <w:iCs/>
+          <w:color w:val="000000"/>
+          <w:sz w:val="24"/>
+          <w:szCs w:val="24"/>
+        </w:rPr>
+        <w:t>commits</w:t>
+      </w:r>
+      <w:proofErr w:type="spellEnd"/>
+      <w:r>
+        <w:rPr>
+          <w:rFonts w:ascii="Times New Roman" w:eastAsia="Arial" w:hAnsi="Times New Roman" w:cs="Times New Roman"/>
+          <w:color w:val="000000"/>
+          <w:sz w:val="24"/>
+          <w:szCs w:val="24"/>
+        </w:rPr>
+        <w:t xml:space="preserve"> al finalizar tareas o en momentos que considerásemos oportunos, como por ejemplo para resolver errores o fallos detectados, </w:t>
+      </w:r>
+      <w:r>
+        <w:rPr>
+          <w:rFonts w:ascii="Times New Roman" w:eastAsia="Arial" w:hAnsi="Times New Roman" w:cs="Times New Roman"/>
+          <w:color w:val="000000"/>
+          <w:sz w:val="24"/>
+          <w:szCs w:val="24"/>
+        </w:rPr>
+        <w:t xml:space="preserve">para finalmente hacer </w:t>
+      </w:r>
+      <w:proofErr w:type="spellStart"/>
+      <w:r>
+        <w:rPr>
+          <w:rFonts w:ascii="Times New Roman" w:eastAsia="Arial" w:hAnsi="Times New Roman" w:cs="Times New Roman"/>
+          <w:i/>
+          <w:iCs/>
+          <w:color w:val="000000"/>
+          <w:sz w:val="24"/>
+          <w:szCs w:val="24"/>
+        </w:rPr>
+        <w:t>merge</w:t>
+      </w:r>
+      <w:proofErr w:type="spellEnd"/>
+      <w:r>
+        <w:rPr>
+          <w:rFonts w:ascii="Times New Roman" w:eastAsia="Arial" w:hAnsi="Times New Roman" w:cs="Times New Roman"/>
+          <w:color w:val="000000"/>
+          <w:sz w:val="24"/>
+          <w:szCs w:val="24"/>
+        </w:rPr>
+        <w:t xml:space="preserve"> en la rama </w:t>
+      </w:r>
+      <w:proofErr w:type="spellStart"/>
+      <w:r>
+        <w:rPr>
+          <w:rFonts w:ascii="Times New Roman" w:eastAsia="Arial" w:hAnsi="Times New Roman" w:cs="Times New Roman"/>
+          <w:i/>
+          <w:iCs/>
+          <w:color w:val="000000"/>
+          <w:sz w:val="24"/>
+          <w:szCs w:val="24"/>
+        </w:rPr>
+        <w:t>main</w:t>
+      </w:r>
+      <w:proofErr w:type="spellEnd"/>
+      <w:r>
+        <w:rPr>
+          <w:rFonts w:ascii="Times New Roman" w:eastAsia="Arial" w:hAnsi="Times New Roman" w:cs="Times New Roman"/>
+          <w:color w:val="000000"/>
+          <w:sz w:val="24"/>
+          <w:szCs w:val="24"/>
+        </w:rPr>
+        <w:t xml:space="preserve"> una vez revisado y de este modo</w:t>
+      </w:r>
+      <w:r>
+        <w:rPr>
+          <w:rFonts w:ascii="Times New Roman" w:eastAsia="Arial" w:hAnsi="Times New Roman" w:cs="Times New Roman"/>
+          <w:color w:val="000000"/>
+          <w:sz w:val="24"/>
+          <w:szCs w:val="24"/>
+        </w:rPr>
+        <w:t xml:space="preserve"> poder </w:t>
+      </w:r>
+      <w:r>
+        <w:rPr>
+          <w:rFonts w:ascii="Times New Roman" w:eastAsia="Arial" w:hAnsi="Times New Roman" w:cs="Times New Roman"/>
+          <w:color w:val="000000"/>
+          <w:sz w:val="24"/>
+          <w:szCs w:val="24"/>
+        </w:rPr>
+        <w:t>tener un registro del progreso del proyecto.</w:t>
       </w:r>
     </w:p>
     <w:p>

</xml_diff>